<commit_message>
Add presentation source updates, PPTX and report fixes
</commit_message>
<xml_diff>
--- a/yeni_50kHz.docx
+++ b/yeni_50kHz.docx
@@ -8676,22 +8676,38 @@
       </w:r>
     </w:p>
     <w:p>
+      <w:proofErr w:type="gramStart"/>
       <w:r>
         <w:rPr>
           <w:rFonts w:ascii="Cascadia Mono SemiLight" w:hAnsi="Cascadia Mono SemiLight"/>
           <w:sz w:val="20"/>
           <w:szCs w:val="20"/>
         </w:rPr>
-        <w:t>run_comparisons.m</w:t>
-      </w:r>
+        <w:t>run</w:t>
+      </w:r>
+      <w:proofErr w:type="gramEnd"/>
       <w:r>
         <w:rPr>
           <w:rFonts w:ascii="Cascadia Mono SemiLight" w:hAnsi="Cascadia Mono SemiLight"/>
+          <w:sz w:val="20"/>
+          <w:szCs w:val="20"/>
+        </w:rPr>
+        <w:t>_comparisons.m</w:t>
+      </w:r>
+      <w:r>
+        <w:rPr>
+          <w:rFonts w:ascii="Cascadia Mono SemiLight" w:hAnsi="Cascadia Mono SemiLight"/>
         </w:rPr>
         <w:t xml:space="preserve"> </w:t>
       </w:r>
       <w:r>
-        <w:t>için kullanılan temel parametreler ve bu parametrelerin karşılaştırmalarının dışındaki varsayılan değerleri:</w:t>
+        <w:t>için kullanılan temel parametreler ve bu parametrelerin</w:t>
+      </w:r>
+      <w:r>
+        <w:t xml:space="preserve"> </w:t>
+      </w:r>
+      <w:r>
+        <w:t>karşılaştırmalarının dışındaki varsayılan değerleri:</w:t>
       </w:r>
     </w:p>
     <w:tbl>
@@ -9713,6 +9729,11 @@
           </wp:inline>
         </w:drawing>
       </w:r>
+      <w:r>
+        <w:t>D</w:t>
+      </w:r>
+      <w:bookmarkStart w:id="1" w:name="_GoBack"/>
+      <w:bookmarkEnd w:id="1"/>
     </w:p>
     <w:p>
       <w:pPr>
@@ -10605,53 +10626,6 @@
             </w:rPr>
             <m:t>rad</m:t>
           </m:r>
-          <m:r>
-            <w:rPr>
-              <w:rFonts w:ascii="Cambria Math" w:hAnsi="Cambria Math"/>
-            </w:rPr>
-            <m:t xml:space="preserve">    </m:t>
-          </m:r>
-          <m:sSub>
-            <m:sSubPr>
-              <m:ctrlPr>
-                <w:rPr>
-                  <w:rFonts w:ascii="Cambria Math" w:hAnsi="Cambria Math"/>
-                  <w:i/>
-                </w:rPr>
-              </m:ctrlPr>
-            </m:sSubPr>
-            <m:e>
-              <m:r>
-                <w:rPr>
-                  <w:rFonts w:ascii="Cambria Math" w:hAnsi="Cambria Math"/>
-                </w:rPr>
-                <m:t>f</m:t>
-              </m:r>
-            </m:e>
-            <m:sub>
-              <m:r>
-                <w:rPr>
-                  <w:rFonts w:ascii="Cambria Math" w:hAnsi="Cambria Math"/>
-                </w:rPr>
-                <m:t>cut-off</m:t>
-              </m:r>
-            </m:sub>
-          </m:sSub>
-          <m:r>
-            <w:rPr>
-              <w:rFonts w:ascii="Cambria Math" w:hAnsi="Cambria Math"/>
-            </w:rPr>
-            <m:t xml:space="preserve">=50 </m:t>
-          </m:r>
-          <m:r>
-            <m:rPr>
-              <m:nor/>
-            </m:rPr>
-            <w:rPr>
-              <w:rFonts w:ascii="Cambria Math" w:hAnsi="Cambria Math"/>
-            </w:rPr>
-            <m:t>kHz</m:t>
-          </m:r>
         </m:oMath>
       </m:oMathPara>
     </w:p>
@@ -10759,13 +10733,8 @@
       </m:oMathPara>
     </w:p>
     <w:p>
-      <w:proofErr w:type="gramStart"/>
-      <w:r>
-        <w:t>daha</w:t>
-      </w:r>
-      <w:proofErr w:type="gramEnd"/>
-      <w:r>
-        <w:t xml:space="preserve"> yüksektir. Böylece sonlu iterasyon ortalamasının yüksek seviyeli bağımsız referans bileşenlerini bastırma davranışı belirgin bir koşulda gözlenmiştir.</w:t>
+      <w:r>
+        <w:t>daha yüksektir. Böylece sonlu iterasyon ortalamasının yüksek seviyeli bağımsız referans bileşenlerini bastırma davranışı belirgin bir koşulda gözlenmiştir.</w:t>
       </w:r>
     </w:p>
     <w:p>
@@ -10826,17 +10795,21 @@
           <w:i/>
           <w:sz w:val="18"/>
         </w:rPr>
-        <w:t xml:space="preserve">Şekil 8.5 – İterasyon sayısının spektral gösterime, tam bant ve dekad MAE’sine etkisi</w:t>
-      </w:r>
-    </w:p>
-    <w:p>
-      <w:r>
-        <w:t xml:space="preserve">Tam bant MAE, 1 iterasyonda 16,699 dB iken 20.000 iterasyonda 0,845 dB’ye düşmüştür; toplam azalma 15,854 dB’dir. Ancak bu tek sayı bütün offset bölgesini birlikte ortaladığı için LPF geçiş bandındaki uyum ile kesim frekansının üzerinde kalan artık ayrışmayı birbirinden ayırmaz.</w:t>
-      </w:r>
-    </w:p>
-    <w:p>
-      <w:r>
-        <w:t xml:space="preserve">Bu nedenle aynı fark dekad bantlarında ayrı ayrı da hesaplanmıştır. Bant MAE’si tam bant metriğiyle aynı kuralı kullanır: iki log-bin eğrisi ortak frekans aralığında dekad başına 40 noktalık tek bir logaritmik ızgaraya enterpole edilir ve her nokta ait olduğu dekada atanır. FFT ızgarasının alt ucunda kalan 1 Hz altındaki parça bir dekadın üçte birinden kısa olduğu için dekad sayılmamış ve raporlanmamıştır; üst uçtaki son bant ise log-bin merkezlerinin bittiği 467 kHz’de sonlanmaktadır. Dekad değerleri Şekil 8.5’te her dekadın ortasına gelecek biçimde eğrilerin üzerine yazılmıştır; log eksende dekad merkezleri eşit aralıklı olduğu için etiketler de eşit aralıklıdır. Aynı değerler sayısal olarak aşağıdaki tabloda verilmiştir:</w:t>
+        <w:t>Şekil 8.5 – İterasyon sayısının spektral gösterime, tam bant ve dekad MAE’sine etkisi</w:t>
+      </w:r>
+    </w:p>
+    <w:p>
+      <w:r>
+        <w:t>Tam bant MAE, 1 iterasyonda 16,699 dB iken 20.000 iterasyonda 0,845 dB’ye düşmüştür; toplam azalma 15,854 dB’dir. Ancak bu tek sayı bütün offset bölgesini birlikte ortaladığı için LPF geçiş bandındaki uyum ile kesim frekansının üzerinde kalan artık ayrışmayı birbirinden ayırmaz.</w:t>
+      </w:r>
+    </w:p>
+    <w:p>
+      <w:r>
+        <w:t xml:space="preserve">Bu nedenle aynı fark dekad bantlarında ayrı ayrı da hesaplanmıştır. Bant MAE’si tam bant metriğiyle aynı kuralı kullanır: iki log-bin eğrisi ortak frekans aralığında dekad başına 40 noktalık tek bir logaritmik ızgaraya enterpole edilir ve her nokta ait olduğu dekada atanır. FFT ızgarasının alt ucunda kalan 1 Hz altındaki parça bir dekadın üçte birinden kısa olduğu için </w:t>
+      </w:r>
+      <w:r>
+        <w:lastRenderedPageBreak/>
+        <w:t>dekad sayılmamış ve raporlanmamıştır; üst uçtaki son bant ise log-bin merkezlerinin bittiği 467 kHz’de sonlanmaktadır. Dekad değerleri Şekil 8.5’te her dekadın ortasına gelecek biçimde eğrilerin üzerine yazılmıştır; log eksende dekad merkezleri eşit aralıklı olduğu için etiketler de eşit aralıklıdır. Aynı değerler sayısal olarak aşağıdaki tabloda verilmiştir:</w:t>
       </w:r>
     </w:p>
     <w:tbl>
@@ -10857,11 +10830,11 @@
       </w:tblGrid>
       <w:tr>
         <w:trPr>
-          <w:cnfStyle w:val="100000000000" w:firstRow="1"/>
+          <w:cnfStyle w:val="100000000000" w:firstRow="1" w:lastRow="0" w:firstColumn="0" w:lastColumn="0" w:oddVBand="0" w:evenVBand="0" w:oddHBand="0" w:evenHBand="0" w:firstRowFirstColumn="0" w:firstRowLastColumn="0" w:lastRowFirstColumn="0" w:lastRowLastColumn="0"/>
         </w:trPr>
         <w:tc>
           <w:tcPr>
-            <w:cnfStyle w:val="001000000000" w:firstColumn="1"/>
+            <w:cnfStyle w:val="001000000000" w:firstRow="0" w:lastRow="0" w:firstColumn="1" w:lastColumn="0" w:oddVBand="0" w:evenVBand="0" w:oddHBand="0" w:evenHBand="0" w:firstRowFirstColumn="0" w:firstRowLastColumn="0" w:lastRowFirstColumn="0" w:lastRowLastColumn="0"/>
             <w:tcW w:w="1078" w:type="dxa"/>
             <w:tcBorders>
               <w:bottom w:val="single" w:sz="12" w:space="0" w:color="auto"/>
@@ -10879,7 +10852,7 @@
                 <w:sz w:val="16"/>
                 <w:szCs w:val="16"/>
               </w:rPr>
-              <w:t xml:space="preserve">İter.</w:t>
+              <w:t>İter.</w:t>
             </w:r>
           </w:p>
         </w:tc>
@@ -10893,18 +10866,18 @@
           <w:p>
             <w:pPr>
               <w:jc w:val="right"/>
-              <w:cnfStyle w:val="100000000000" w:firstRow="1"/>
-              <w:rPr>
-                <w:sz w:val="16"/>
-                <w:szCs w:val="16"/>
-              </w:rPr>
-            </w:pPr>
-            <w:r>
-              <w:rPr>
-                <w:sz w:val="16"/>
-                <w:szCs w:val="16"/>
-              </w:rPr>
-              <w:t xml:space="preserve">1–10 Hz</w:t>
+              <w:cnfStyle w:val="100000000000" w:firstRow="1" w:lastRow="0" w:firstColumn="0" w:lastColumn="0" w:oddVBand="0" w:evenVBand="0" w:oddHBand="0" w:evenHBand="0" w:firstRowFirstColumn="0" w:firstRowLastColumn="0" w:lastRowFirstColumn="0" w:lastRowLastColumn="0"/>
+              <w:rPr>
+                <w:sz w:val="16"/>
+                <w:szCs w:val="16"/>
+              </w:rPr>
+            </w:pPr>
+            <w:r>
+              <w:rPr>
+                <w:sz w:val="16"/>
+                <w:szCs w:val="16"/>
+              </w:rPr>
+              <w:t>1–10 Hz</w:t>
             </w:r>
           </w:p>
         </w:tc>
@@ -10918,18 +10891,18 @@
           <w:p>
             <w:pPr>
               <w:jc w:val="right"/>
-              <w:cnfStyle w:val="100000000000" w:firstRow="1"/>
-              <w:rPr>
-                <w:sz w:val="16"/>
-                <w:szCs w:val="16"/>
-              </w:rPr>
-            </w:pPr>
-            <w:r>
-              <w:rPr>
-                <w:sz w:val="16"/>
-                <w:szCs w:val="16"/>
-              </w:rPr>
-              <w:t xml:space="preserve">10–100 Hz</w:t>
+              <w:cnfStyle w:val="100000000000" w:firstRow="1" w:lastRow="0" w:firstColumn="0" w:lastColumn="0" w:oddVBand="0" w:evenVBand="0" w:oddHBand="0" w:evenHBand="0" w:firstRowFirstColumn="0" w:firstRowLastColumn="0" w:lastRowFirstColumn="0" w:lastRowLastColumn="0"/>
+              <w:rPr>
+                <w:sz w:val="16"/>
+                <w:szCs w:val="16"/>
+              </w:rPr>
+            </w:pPr>
+            <w:r>
+              <w:rPr>
+                <w:sz w:val="16"/>
+                <w:szCs w:val="16"/>
+              </w:rPr>
+              <w:t>10–100 Hz</w:t>
             </w:r>
           </w:p>
         </w:tc>
@@ -10943,18 +10916,18 @@
           <w:p>
             <w:pPr>
               <w:jc w:val="right"/>
-              <w:cnfStyle w:val="100000000000" w:firstRow="1"/>
-              <w:rPr>
-                <w:sz w:val="16"/>
-                <w:szCs w:val="16"/>
-              </w:rPr>
-            </w:pPr>
-            <w:r>
-              <w:rPr>
-                <w:sz w:val="16"/>
-                <w:szCs w:val="16"/>
-              </w:rPr>
-              <w:t xml:space="preserve">0,1–1 kHz</w:t>
+              <w:cnfStyle w:val="100000000000" w:firstRow="1" w:lastRow="0" w:firstColumn="0" w:lastColumn="0" w:oddVBand="0" w:evenVBand="0" w:oddHBand="0" w:evenHBand="0" w:firstRowFirstColumn="0" w:firstRowLastColumn="0" w:lastRowFirstColumn="0" w:lastRowLastColumn="0"/>
+              <w:rPr>
+                <w:sz w:val="16"/>
+                <w:szCs w:val="16"/>
+              </w:rPr>
+            </w:pPr>
+            <w:r>
+              <w:rPr>
+                <w:sz w:val="16"/>
+                <w:szCs w:val="16"/>
+              </w:rPr>
+              <w:t>0,1–1 kHz</w:t>
             </w:r>
           </w:p>
         </w:tc>
@@ -10968,18 +10941,18 @@
           <w:p>
             <w:pPr>
               <w:jc w:val="right"/>
-              <w:cnfStyle w:val="100000000000" w:firstRow="1"/>
-              <w:rPr>
-                <w:sz w:val="16"/>
-                <w:szCs w:val="16"/>
-              </w:rPr>
-            </w:pPr>
-            <w:r>
-              <w:rPr>
-                <w:sz w:val="16"/>
-                <w:szCs w:val="16"/>
-              </w:rPr>
-              <w:t xml:space="preserve">1–10 kHz</w:t>
+              <w:cnfStyle w:val="100000000000" w:firstRow="1" w:lastRow="0" w:firstColumn="0" w:lastColumn="0" w:oddVBand="0" w:evenVBand="0" w:oddHBand="0" w:evenHBand="0" w:firstRowFirstColumn="0" w:firstRowLastColumn="0" w:lastRowFirstColumn="0" w:lastRowLastColumn="0"/>
+              <w:rPr>
+                <w:sz w:val="16"/>
+                <w:szCs w:val="16"/>
+              </w:rPr>
+            </w:pPr>
+            <w:r>
+              <w:rPr>
+                <w:sz w:val="16"/>
+                <w:szCs w:val="16"/>
+              </w:rPr>
+              <w:t>1–10 kHz</w:t>
             </w:r>
           </w:p>
         </w:tc>
@@ -10993,18 +10966,18 @@
           <w:p>
             <w:pPr>
               <w:jc w:val="right"/>
-              <w:cnfStyle w:val="100000000000" w:firstRow="1"/>
-              <w:rPr>
-                <w:sz w:val="16"/>
-                <w:szCs w:val="16"/>
-              </w:rPr>
-            </w:pPr>
-            <w:r>
-              <w:rPr>
-                <w:sz w:val="16"/>
-                <w:szCs w:val="16"/>
-              </w:rPr>
-              <w:t xml:space="preserve">10–100 kHz</w:t>
+              <w:cnfStyle w:val="100000000000" w:firstRow="1" w:lastRow="0" w:firstColumn="0" w:lastColumn="0" w:oddVBand="0" w:evenVBand="0" w:oddHBand="0" w:evenHBand="0" w:firstRowFirstColumn="0" w:firstRowLastColumn="0" w:lastRowFirstColumn="0" w:lastRowLastColumn="0"/>
+              <w:rPr>
+                <w:sz w:val="16"/>
+                <w:szCs w:val="16"/>
+              </w:rPr>
+            </w:pPr>
+            <w:r>
+              <w:rPr>
+                <w:sz w:val="16"/>
+                <w:szCs w:val="16"/>
+              </w:rPr>
+              <w:t>10–100 kHz</w:t>
             </w:r>
           </w:p>
         </w:tc>
@@ -11018,18 +10991,18 @@
           <w:p>
             <w:pPr>
               <w:jc w:val="right"/>
-              <w:cnfStyle w:val="100000000000" w:firstRow="1"/>
-              <w:rPr>
-                <w:sz w:val="16"/>
-                <w:szCs w:val="16"/>
-              </w:rPr>
-            </w:pPr>
-            <w:r>
-              <w:rPr>
-                <w:sz w:val="16"/>
-                <w:szCs w:val="16"/>
-              </w:rPr>
-              <w:t xml:space="preserve">100–467 kHz</w:t>
+              <w:cnfStyle w:val="100000000000" w:firstRow="1" w:lastRow="0" w:firstColumn="0" w:lastColumn="0" w:oddVBand="0" w:evenVBand="0" w:oddHBand="0" w:evenHBand="0" w:firstRowFirstColumn="0" w:firstRowLastColumn="0" w:lastRowFirstColumn="0" w:lastRowLastColumn="0"/>
+              <w:rPr>
+                <w:sz w:val="16"/>
+                <w:szCs w:val="16"/>
+              </w:rPr>
+            </w:pPr>
+            <w:r>
+              <w:rPr>
+                <w:sz w:val="16"/>
+                <w:szCs w:val="16"/>
+              </w:rPr>
+              <w:t>100–467 kHz</w:t>
             </w:r>
           </w:p>
         </w:tc>
@@ -11043,29 +11016,29 @@
           <w:p>
             <w:pPr>
               <w:jc w:val="right"/>
-              <w:cnfStyle w:val="100000000000" w:firstRow="1"/>
-              <w:rPr>
-                <w:sz w:val="16"/>
-                <w:szCs w:val="16"/>
-              </w:rPr>
-            </w:pPr>
-            <w:r>
-              <w:rPr>
-                <w:sz w:val="16"/>
-                <w:szCs w:val="16"/>
-              </w:rPr>
-              <w:t xml:space="preserve">Tam bant</w:t>
+              <w:cnfStyle w:val="100000000000" w:firstRow="1" w:lastRow="0" w:firstColumn="0" w:lastColumn="0" w:oddVBand="0" w:evenVBand="0" w:oddHBand="0" w:evenHBand="0" w:firstRowFirstColumn="0" w:firstRowLastColumn="0" w:lastRowFirstColumn="0" w:lastRowLastColumn="0"/>
+              <w:rPr>
+                <w:sz w:val="16"/>
+                <w:szCs w:val="16"/>
+              </w:rPr>
+            </w:pPr>
+            <w:r>
+              <w:rPr>
+                <w:sz w:val="16"/>
+                <w:szCs w:val="16"/>
+              </w:rPr>
+              <w:t>Tam bant</w:t>
             </w:r>
           </w:p>
         </w:tc>
       </w:tr>
       <w:tr>
         <w:trPr>
-          <w:cnfStyle w:val="000000100000" w:oddHBand="1"/>
+          <w:cnfStyle w:val="000000100000" w:firstRow="0" w:lastRow="0" w:firstColumn="0" w:lastColumn="0" w:oddVBand="0" w:evenVBand="0" w:oddHBand="1" w:evenHBand="0" w:firstRowFirstColumn="0" w:firstRowLastColumn="0" w:lastRowFirstColumn="0" w:lastRowLastColumn="0"/>
         </w:trPr>
         <w:tc>
           <w:tcPr>
-            <w:cnfStyle w:val="001000000000" w:firstColumn="1"/>
+            <w:cnfStyle w:val="001000000000" w:firstRow="0" w:lastRow="0" w:firstColumn="1" w:lastColumn="0" w:oddVBand="0" w:evenVBand="0" w:oddHBand="0" w:evenHBand="0" w:firstRowFirstColumn="0" w:firstRowLastColumn="0" w:lastRowFirstColumn="0" w:lastRowLastColumn="0"/>
             <w:tcW w:w="1078" w:type="dxa"/>
           </w:tcPr>
           <w:p>
@@ -11080,7 +11053,7 @@
                 <w:sz w:val="16"/>
                 <w:szCs w:val="16"/>
               </w:rPr>
-              <w:t xml:space="preserve">1</w:t>
+              <w:t>1</w:t>
             </w:r>
           </w:p>
         </w:tc>
@@ -11091,18 +11064,18 @@
           <w:p>
             <w:pPr>
               <w:jc w:val="right"/>
-              <w:cnfStyle w:val="000000100000" w:oddHBand="1"/>
-              <w:rPr>
-                <w:sz w:val="16"/>
-                <w:szCs w:val="16"/>
-              </w:rPr>
-            </w:pPr>
-            <w:r>
-              <w:rPr>
-                <w:sz w:val="16"/>
-                <w:szCs w:val="16"/>
-              </w:rPr>
-              <w:t xml:space="preserve">11,303</w:t>
+              <w:cnfStyle w:val="000000100000" w:firstRow="0" w:lastRow="0" w:firstColumn="0" w:lastColumn="0" w:oddVBand="0" w:evenVBand="0" w:oddHBand="1" w:evenHBand="0" w:firstRowFirstColumn="0" w:firstRowLastColumn="0" w:lastRowFirstColumn="0" w:lastRowLastColumn="0"/>
+              <w:rPr>
+                <w:sz w:val="16"/>
+                <w:szCs w:val="16"/>
+              </w:rPr>
+            </w:pPr>
+            <w:r>
+              <w:rPr>
+                <w:sz w:val="16"/>
+                <w:szCs w:val="16"/>
+              </w:rPr>
+              <w:t>11,303</w:t>
             </w:r>
           </w:p>
         </w:tc>
@@ -11113,18 +11086,18 @@
           <w:p>
             <w:pPr>
               <w:jc w:val="right"/>
-              <w:cnfStyle w:val="000000100000" w:oddHBand="1"/>
-              <w:rPr>
-                <w:sz w:val="16"/>
-                <w:szCs w:val="16"/>
-              </w:rPr>
-            </w:pPr>
-            <w:r>
-              <w:rPr>
-                <w:sz w:val="16"/>
-                <w:szCs w:val="16"/>
-              </w:rPr>
-              <w:t xml:space="preserve">15,626</w:t>
+              <w:cnfStyle w:val="000000100000" w:firstRow="0" w:lastRow="0" w:firstColumn="0" w:lastColumn="0" w:oddVBand="0" w:evenVBand="0" w:oddHBand="1" w:evenHBand="0" w:firstRowFirstColumn="0" w:firstRowLastColumn="0" w:lastRowFirstColumn="0" w:lastRowLastColumn="0"/>
+              <w:rPr>
+                <w:sz w:val="16"/>
+                <w:szCs w:val="16"/>
+              </w:rPr>
+            </w:pPr>
+            <w:r>
+              <w:rPr>
+                <w:sz w:val="16"/>
+                <w:szCs w:val="16"/>
+              </w:rPr>
+              <w:t>15,626</w:t>
             </w:r>
           </w:p>
         </w:tc>
@@ -11135,18 +11108,18 @@
           <w:p>
             <w:pPr>
               <w:jc w:val="right"/>
-              <w:cnfStyle w:val="000000100000" w:oddHBand="1"/>
-              <w:rPr>
-                <w:sz w:val="16"/>
-                <w:szCs w:val="16"/>
-              </w:rPr>
-            </w:pPr>
-            <w:r>
-              <w:rPr>
-                <w:sz w:val="16"/>
-                <w:szCs w:val="16"/>
-              </w:rPr>
-              <w:t xml:space="preserve">18,423</w:t>
+              <w:cnfStyle w:val="000000100000" w:firstRow="0" w:lastRow="0" w:firstColumn="0" w:lastColumn="0" w:oddVBand="0" w:evenVBand="0" w:oddHBand="1" w:evenHBand="0" w:firstRowFirstColumn="0" w:firstRowLastColumn="0" w:lastRowFirstColumn="0" w:lastRowLastColumn="0"/>
+              <w:rPr>
+                <w:sz w:val="16"/>
+                <w:szCs w:val="16"/>
+              </w:rPr>
+            </w:pPr>
+            <w:r>
+              <w:rPr>
+                <w:sz w:val="16"/>
+                <w:szCs w:val="16"/>
+              </w:rPr>
+              <w:t>18,423</w:t>
             </w:r>
           </w:p>
         </w:tc>
@@ -11157,18 +11130,18 @@
           <w:p>
             <w:pPr>
               <w:jc w:val="right"/>
-              <w:cnfStyle w:val="000000100000" w:oddHBand="1"/>
-              <w:rPr>
-                <w:sz w:val="16"/>
-                <w:szCs w:val="16"/>
-              </w:rPr>
-            </w:pPr>
-            <w:r>
-              <w:rPr>
-                <w:sz w:val="16"/>
-                <w:szCs w:val="16"/>
-              </w:rPr>
-              <w:t xml:space="preserve">18,879</w:t>
+              <w:cnfStyle w:val="000000100000" w:firstRow="0" w:lastRow="0" w:firstColumn="0" w:lastColumn="0" w:oddVBand="0" w:evenVBand="0" w:oddHBand="1" w:evenHBand="0" w:firstRowFirstColumn="0" w:firstRowLastColumn="0" w:lastRowFirstColumn="0" w:lastRowLastColumn="0"/>
+              <w:rPr>
+                <w:sz w:val="16"/>
+                <w:szCs w:val="16"/>
+              </w:rPr>
+            </w:pPr>
+            <w:r>
+              <w:rPr>
+                <w:sz w:val="16"/>
+                <w:szCs w:val="16"/>
+              </w:rPr>
+              <w:t>18,879</w:t>
             </w:r>
           </w:p>
         </w:tc>
@@ -11179,18 +11152,18 @@
           <w:p>
             <w:pPr>
               <w:jc w:val="right"/>
-              <w:cnfStyle w:val="000000100000" w:oddHBand="1"/>
-              <w:rPr>
-                <w:sz w:val="16"/>
-                <w:szCs w:val="16"/>
-              </w:rPr>
-            </w:pPr>
-            <w:r>
-              <w:rPr>
-                <w:sz w:val="16"/>
-                <w:szCs w:val="16"/>
-              </w:rPr>
-              <w:t xml:space="preserve">18,075</w:t>
+              <w:cnfStyle w:val="000000100000" w:firstRow="0" w:lastRow="0" w:firstColumn="0" w:lastColumn="0" w:oddVBand="0" w:evenVBand="0" w:oddHBand="1" w:evenHBand="0" w:firstRowFirstColumn="0" w:firstRowLastColumn="0" w:lastRowFirstColumn="0" w:lastRowLastColumn="0"/>
+              <w:rPr>
+                <w:sz w:val="16"/>
+                <w:szCs w:val="16"/>
+              </w:rPr>
+            </w:pPr>
+            <w:r>
+              <w:rPr>
+                <w:sz w:val="16"/>
+                <w:szCs w:val="16"/>
+              </w:rPr>
+              <w:t>18,075</w:t>
             </w:r>
           </w:p>
         </w:tc>
@@ -11201,18 +11174,18 @@
           <w:p>
             <w:pPr>
               <w:jc w:val="right"/>
-              <w:cnfStyle w:val="000000100000" w:oddHBand="1"/>
-              <w:rPr>
-                <w:sz w:val="16"/>
-                <w:szCs w:val="16"/>
-              </w:rPr>
-            </w:pPr>
-            <w:r>
-              <w:rPr>
-                <w:sz w:val="16"/>
-                <w:szCs w:val="16"/>
-              </w:rPr>
-              <w:t xml:space="preserve">15,960</w:t>
+              <w:cnfStyle w:val="000000100000" w:firstRow="0" w:lastRow="0" w:firstColumn="0" w:lastColumn="0" w:oddVBand="0" w:evenVBand="0" w:oddHBand="1" w:evenHBand="0" w:firstRowFirstColumn="0" w:firstRowLastColumn="0" w:lastRowFirstColumn="0" w:lastRowLastColumn="0"/>
+              <w:rPr>
+                <w:sz w:val="16"/>
+                <w:szCs w:val="16"/>
+              </w:rPr>
+            </w:pPr>
+            <w:r>
+              <w:rPr>
+                <w:sz w:val="16"/>
+                <w:szCs w:val="16"/>
+              </w:rPr>
+              <w:t>15,960</w:t>
             </w:r>
           </w:p>
         </w:tc>
@@ -11223,27 +11196,26 @@
           <w:p>
             <w:pPr>
               <w:jc w:val="right"/>
-              <w:cnfStyle w:val="000000100000" w:oddHBand="1"/>
-              <w:rPr>
-                <w:sz w:val="16"/>
-                <w:szCs w:val="16"/>
-              </w:rPr>
-            </w:pPr>
-            <w:r>
-              <w:rPr>
-                <w:sz w:val="16"/>
-                <w:szCs w:val="16"/>
-              </w:rPr>
-              <w:t xml:space="preserve">16,699</w:t>
+              <w:cnfStyle w:val="000000100000" w:firstRow="0" w:lastRow="0" w:firstColumn="0" w:lastColumn="0" w:oddVBand="0" w:evenVBand="0" w:oddHBand="1" w:evenHBand="0" w:firstRowFirstColumn="0" w:firstRowLastColumn="0" w:lastRowFirstColumn="0" w:lastRowLastColumn="0"/>
+              <w:rPr>
+                <w:sz w:val="16"/>
+                <w:szCs w:val="16"/>
+              </w:rPr>
+            </w:pPr>
+            <w:r>
+              <w:rPr>
+                <w:sz w:val="16"/>
+                <w:szCs w:val="16"/>
+              </w:rPr>
+              <w:t>16,699</w:t>
             </w:r>
           </w:p>
         </w:tc>
       </w:tr>
       <w:tr>
-        <w:trPr/>
-        <w:tc>
-          <w:tcPr>
-            <w:cnfStyle w:val="001000000000" w:firstColumn="1"/>
+        <w:tc>
+          <w:tcPr>
+            <w:cnfStyle w:val="001000000000" w:firstRow="0" w:lastRow="0" w:firstColumn="1" w:lastColumn="0" w:oddVBand="0" w:evenVBand="0" w:oddHBand="0" w:evenHBand="0" w:firstRowFirstColumn="0" w:firstRowLastColumn="0" w:lastRowFirstColumn="0" w:lastRowLastColumn="0"/>
             <w:tcW w:w="1078" w:type="dxa"/>
           </w:tcPr>
           <w:p>
@@ -11258,7 +11230,7 @@
                 <w:sz w:val="16"/>
                 <w:szCs w:val="16"/>
               </w:rPr>
-              <w:t xml:space="preserve">50</w:t>
+              <w:t>50</w:t>
             </w:r>
           </w:p>
         </w:tc>
@@ -11269,17 +11241,18 @@
           <w:p>
             <w:pPr>
               <w:jc w:val="right"/>
-              <w:rPr>
-                <w:sz w:val="16"/>
-                <w:szCs w:val="16"/>
-              </w:rPr>
-            </w:pPr>
-            <w:r>
-              <w:rPr>
-                <w:sz w:val="16"/>
-                <w:szCs w:val="16"/>
-              </w:rPr>
-              <w:t xml:space="preserve">7,127</w:t>
+              <w:cnfStyle w:val="000000000000" w:firstRow="0" w:lastRow="0" w:firstColumn="0" w:lastColumn="0" w:oddVBand="0" w:evenVBand="0" w:oddHBand="0" w:evenHBand="0" w:firstRowFirstColumn="0" w:firstRowLastColumn="0" w:lastRowFirstColumn="0" w:lastRowLastColumn="0"/>
+              <w:rPr>
+                <w:sz w:val="16"/>
+                <w:szCs w:val="16"/>
+              </w:rPr>
+            </w:pPr>
+            <w:r>
+              <w:rPr>
+                <w:sz w:val="16"/>
+                <w:szCs w:val="16"/>
+              </w:rPr>
+              <w:t>7,127</w:t>
             </w:r>
           </w:p>
         </w:tc>
@@ -11290,17 +11263,18 @@
           <w:p>
             <w:pPr>
               <w:jc w:val="right"/>
-              <w:rPr>
-                <w:sz w:val="16"/>
-                <w:szCs w:val="16"/>
-              </w:rPr>
-            </w:pPr>
-            <w:r>
-              <w:rPr>
-                <w:sz w:val="16"/>
-                <w:szCs w:val="16"/>
-              </w:rPr>
-              <w:t xml:space="preserve">6,841</w:t>
+              <w:cnfStyle w:val="000000000000" w:firstRow="0" w:lastRow="0" w:firstColumn="0" w:lastColumn="0" w:oddVBand="0" w:evenVBand="0" w:oddHBand="0" w:evenHBand="0" w:firstRowFirstColumn="0" w:firstRowLastColumn="0" w:lastRowFirstColumn="0" w:lastRowLastColumn="0"/>
+              <w:rPr>
+                <w:sz w:val="16"/>
+                <w:szCs w:val="16"/>
+              </w:rPr>
+            </w:pPr>
+            <w:r>
+              <w:rPr>
+                <w:sz w:val="16"/>
+                <w:szCs w:val="16"/>
+              </w:rPr>
+              <w:t>6,841</w:t>
             </w:r>
           </w:p>
         </w:tc>
@@ -11311,17 +11285,18 @@
           <w:p>
             <w:pPr>
               <w:jc w:val="right"/>
-              <w:rPr>
-                <w:sz w:val="16"/>
-                <w:szCs w:val="16"/>
-              </w:rPr>
-            </w:pPr>
-            <w:r>
-              <w:rPr>
-                <w:sz w:val="16"/>
-                <w:szCs w:val="16"/>
-              </w:rPr>
-              <w:t xml:space="preserve">6,584</w:t>
+              <w:cnfStyle w:val="000000000000" w:firstRow="0" w:lastRow="0" w:firstColumn="0" w:lastColumn="0" w:oddVBand="0" w:evenVBand="0" w:oddHBand="0" w:evenHBand="0" w:firstRowFirstColumn="0" w:firstRowLastColumn="0" w:lastRowFirstColumn="0" w:lastRowLastColumn="0"/>
+              <w:rPr>
+                <w:sz w:val="16"/>
+                <w:szCs w:val="16"/>
+              </w:rPr>
+            </w:pPr>
+            <w:r>
+              <w:rPr>
+                <w:sz w:val="16"/>
+                <w:szCs w:val="16"/>
+              </w:rPr>
+              <w:t>6,584</w:t>
             </w:r>
           </w:p>
         </w:tc>
@@ -11332,17 +11307,18 @@
           <w:p>
             <w:pPr>
               <w:jc w:val="right"/>
-              <w:rPr>
-                <w:sz w:val="16"/>
-                <w:szCs w:val="16"/>
-              </w:rPr>
-            </w:pPr>
-            <w:r>
-              <w:rPr>
-                <w:sz w:val="16"/>
-                <w:szCs w:val="16"/>
-              </w:rPr>
-              <w:t xml:space="preserve">6,617</w:t>
+              <w:cnfStyle w:val="000000000000" w:firstRow="0" w:lastRow="0" w:firstColumn="0" w:lastColumn="0" w:oddVBand="0" w:evenVBand="0" w:oddHBand="0" w:evenHBand="0" w:firstRowFirstColumn="0" w:firstRowLastColumn="0" w:lastRowFirstColumn="0" w:lastRowLastColumn="0"/>
+              <w:rPr>
+                <w:sz w:val="16"/>
+                <w:szCs w:val="16"/>
+              </w:rPr>
+            </w:pPr>
+            <w:r>
+              <w:rPr>
+                <w:sz w:val="16"/>
+                <w:szCs w:val="16"/>
+              </w:rPr>
+              <w:t>6,617</w:t>
             </w:r>
           </w:p>
         </w:tc>
@@ -11353,17 +11329,18 @@
           <w:p>
             <w:pPr>
               <w:jc w:val="right"/>
-              <w:rPr>
-                <w:sz w:val="16"/>
-                <w:szCs w:val="16"/>
-              </w:rPr>
-            </w:pPr>
-            <w:r>
-              <w:rPr>
-                <w:sz w:val="16"/>
-                <w:szCs w:val="16"/>
-              </w:rPr>
-              <w:t xml:space="preserve">6,601</w:t>
+              <w:cnfStyle w:val="000000000000" w:firstRow="0" w:lastRow="0" w:firstColumn="0" w:lastColumn="0" w:oddVBand="0" w:evenVBand="0" w:oddHBand="0" w:evenHBand="0" w:firstRowFirstColumn="0" w:firstRowLastColumn="0" w:lastRowFirstColumn="0" w:lastRowLastColumn="0"/>
+              <w:rPr>
+                <w:sz w:val="16"/>
+                <w:szCs w:val="16"/>
+              </w:rPr>
+            </w:pPr>
+            <w:r>
+              <w:rPr>
+                <w:sz w:val="16"/>
+                <w:szCs w:val="16"/>
+              </w:rPr>
+              <w:t>6,601</w:t>
             </w:r>
           </w:p>
         </w:tc>
@@ -11374,17 +11351,18 @@
           <w:p>
             <w:pPr>
               <w:jc w:val="right"/>
-              <w:rPr>
-                <w:sz w:val="16"/>
-                <w:szCs w:val="16"/>
-              </w:rPr>
-            </w:pPr>
-            <w:r>
-              <w:rPr>
-                <w:sz w:val="16"/>
-                <w:szCs w:val="16"/>
-              </w:rPr>
-              <w:t xml:space="preserve">3,734</w:t>
+              <w:cnfStyle w:val="000000000000" w:firstRow="0" w:lastRow="0" w:firstColumn="0" w:lastColumn="0" w:oddVBand="0" w:evenVBand="0" w:oddHBand="0" w:evenHBand="0" w:firstRowFirstColumn="0" w:firstRowLastColumn="0" w:lastRowFirstColumn="0" w:lastRowLastColumn="0"/>
+              <w:rPr>
+                <w:sz w:val="16"/>
+                <w:szCs w:val="16"/>
+              </w:rPr>
+            </w:pPr>
+            <w:r>
+              <w:rPr>
+                <w:sz w:val="16"/>
+                <w:szCs w:val="16"/>
+              </w:rPr>
+              <w:t>3,734</w:t>
             </w:r>
           </w:p>
         </w:tc>
@@ -11395,28 +11373,29 @@
           <w:p>
             <w:pPr>
               <w:jc w:val="right"/>
-              <w:rPr>
-                <w:sz w:val="16"/>
-                <w:szCs w:val="16"/>
-              </w:rPr>
-            </w:pPr>
-            <w:r>
-              <w:rPr>
-                <w:sz w:val="16"/>
-                <w:szCs w:val="16"/>
-              </w:rPr>
-              <w:t xml:space="preserve">6,340</w:t>
+              <w:cnfStyle w:val="000000000000" w:firstRow="0" w:lastRow="0" w:firstColumn="0" w:lastColumn="0" w:oddVBand="0" w:evenVBand="0" w:oddHBand="0" w:evenHBand="0" w:firstRowFirstColumn="0" w:firstRowLastColumn="0" w:lastRowFirstColumn="0" w:lastRowLastColumn="0"/>
+              <w:rPr>
+                <w:sz w:val="16"/>
+                <w:szCs w:val="16"/>
+              </w:rPr>
+            </w:pPr>
+            <w:r>
+              <w:rPr>
+                <w:sz w:val="16"/>
+                <w:szCs w:val="16"/>
+              </w:rPr>
+              <w:t>6,340</w:t>
             </w:r>
           </w:p>
         </w:tc>
       </w:tr>
       <w:tr>
         <w:trPr>
-          <w:cnfStyle w:val="000000100000" w:oddHBand="1"/>
+          <w:cnfStyle w:val="000000100000" w:firstRow="0" w:lastRow="0" w:firstColumn="0" w:lastColumn="0" w:oddVBand="0" w:evenVBand="0" w:oddHBand="1" w:evenHBand="0" w:firstRowFirstColumn="0" w:firstRowLastColumn="0" w:lastRowFirstColumn="0" w:lastRowLastColumn="0"/>
         </w:trPr>
         <w:tc>
           <w:tcPr>
-            <w:cnfStyle w:val="001000000000" w:firstColumn="1"/>
+            <w:cnfStyle w:val="001000000000" w:firstRow="0" w:lastRow="0" w:firstColumn="1" w:lastColumn="0" w:oddVBand="0" w:evenVBand="0" w:oddHBand="0" w:evenHBand="0" w:firstRowFirstColumn="0" w:firstRowLastColumn="0" w:lastRowFirstColumn="0" w:lastRowLastColumn="0"/>
             <w:tcW w:w="1078" w:type="dxa"/>
           </w:tcPr>
           <w:p>
@@ -11431,7 +11410,7 @@
                 <w:sz w:val="16"/>
                 <w:szCs w:val="16"/>
               </w:rPr>
-              <w:t xml:space="preserve">250</w:t>
+              <w:t>250</w:t>
             </w:r>
           </w:p>
         </w:tc>
@@ -11442,18 +11421,18 @@
           <w:p>
             <w:pPr>
               <w:jc w:val="right"/>
-              <w:cnfStyle w:val="000000100000" w:oddHBand="1"/>
-              <w:rPr>
-                <w:sz w:val="16"/>
-                <w:szCs w:val="16"/>
-              </w:rPr>
-            </w:pPr>
-            <w:r>
-              <w:rPr>
-                <w:sz w:val="16"/>
-                <w:szCs w:val="16"/>
-              </w:rPr>
-              <w:t xml:space="preserve">2,023</w:t>
+              <w:cnfStyle w:val="000000100000" w:firstRow="0" w:lastRow="0" w:firstColumn="0" w:lastColumn="0" w:oddVBand="0" w:evenVBand="0" w:oddHBand="1" w:evenHBand="0" w:firstRowFirstColumn="0" w:firstRowLastColumn="0" w:lastRowFirstColumn="0" w:lastRowLastColumn="0"/>
+              <w:rPr>
+                <w:sz w:val="16"/>
+                <w:szCs w:val="16"/>
+              </w:rPr>
+            </w:pPr>
+            <w:r>
+              <w:rPr>
+                <w:sz w:val="16"/>
+                <w:szCs w:val="16"/>
+              </w:rPr>
+              <w:t>2,023</w:t>
             </w:r>
           </w:p>
         </w:tc>
@@ -11464,18 +11443,18 @@
           <w:p>
             <w:pPr>
               <w:jc w:val="right"/>
-              <w:cnfStyle w:val="000000100000" w:oddHBand="1"/>
-              <w:rPr>
-                <w:sz w:val="16"/>
-                <w:szCs w:val="16"/>
-              </w:rPr>
-            </w:pPr>
-            <w:r>
-              <w:rPr>
-                <w:sz w:val="16"/>
-                <w:szCs w:val="16"/>
-              </w:rPr>
-              <w:t xml:space="preserve">2,380</w:t>
+              <w:cnfStyle w:val="000000100000" w:firstRow="0" w:lastRow="0" w:firstColumn="0" w:lastColumn="0" w:oddVBand="0" w:evenVBand="0" w:oddHBand="1" w:evenHBand="0" w:firstRowFirstColumn="0" w:firstRowLastColumn="0" w:lastRowFirstColumn="0" w:lastRowLastColumn="0"/>
+              <w:rPr>
+                <w:sz w:val="16"/>
+                <w:szCs w:val="16"/>
+              </w:rPr>
+            </w:pPr>
+            <w:r>
+              <w:rPr>
+                <w:sz w:val="16"/>
+                <w:szCs w:val="16"/>
+              </w:rPr>
+              <w:t>2,380</w:t>
             </w:r>
           </w:p>
         </w:tc>
@@ -11486,18 +11465,18 @@
           <w:p>
             <w:pPr>
               <w:jc w:val="right"/>
-              <w:cnfStyle w:val="000000100000" w:oddHBand="1"/>
-              <w:rPr>
-                <w:sz w:val="16"/>
-                <w:szCs w:val="16"/>
-              </w:rPr>
-            </w:pPr>
-            <w:r>
-              <w:rPr>
-                <w:sz w:val="16"/>
-                <w:szCs w:val="16"/>
-              </w:rPr>
-              <w:t xml:space="preserve">3,260</w:t>
+              <w:cnfStyle w:val="000000100000" w:firstRow="0" w:lastRow="0" w:firstColumn="0" w:lastColumn="0" w:oddVBand="0" w:evenVBand="0" w:oddHBand="1" w:evenHBand="0" w:firstRowFirstColumn="0" w:firstRowLastColumn="0" w:lastRowFirstColumn="0" w:lastRowLastColumn="0"/>
+              <w:rPr>
+                <w:sz w:val="16"/>
+                <w:szCs w:val="16"/>
+              </w:rPr>
+            </w:pPr>
+            <w:r>
+              <w:rPr>
+                <w:sz w:val="16"/>
+                <w:szCs w:val="16"/>
+              </w:rPr>
+              <w:t>3,260</w:t>
             </w:r>
           </w:p>
         </w:tc>
@@ -11508,18 +11487,18 @@
           <w:p>
             <w:pPr>
               <w:jc w:val="right"/>
-              <w:cnfStyle w:val="000000100000" w:oddHBand="1"/>
-              <w:rPr>
-                <w:sz w:val="16"/>
-                <w:szCs w:val="16"/>
-              </w:rPr>
-            </w:pPr>
-            <w:r>
-              <w:rPr>
-                <w:sz w:val="16"/>
-                <w:szCs w:val="16"/>
-              </w:rPr>
-              <w:t xml:space="preserve">3,489</w:t>
+              <w:cnfStyle w:val="000000100000" w:firstRow="0" w:lastRow="0" w:firstColumn="0" w:lastColumn="0" w:oddVBand="0" w:evenVBand="0" w:oddHBand="1" w:evenHBand="0" w:firstRowFirstColumn="0" w:firstRowLastColumn="0" w:lastRowFirstColumn="0" w:lastRowLastColumn="0"/>
+              <w:rPr>
+                <w:sz w:val="16"/>
+                <w:szCs w:val="16"/>
+              </w:rPr>
+            </w:pPr>
+            <w:r>
+              <w:rPr>
+                <w:sz w:val="16"/>
+                <w:szCs w:val="16"/>
+              </w:rPr>
+              <w:t>3,489</w:t>
             </w:r>
           </w:p>
         </w:tc>
@@ -11530,18 +11509,18 @@
           <w:p>
             <w:pPr>
               <w:jc w:val="right"/>
-              <w:cnfStyle w:val="000000100000" w:oddHBand="1"/>
-              <w:rPr>
-                <w:sz w:val="16"/>
-                <w:szCs w:val="16"/>
-              </w:rPr>
-            </w:pPr>
-            <w:r>
-              <w:rPr>
-                <w:sz w:val="16"/>
-                <w:szCs w:val="16"/>
-              </w:rPr>
-              <w:t xml:space="preserve">2,001</w:t>
+              <w:cnfStyle w:val="000000100000" w:firstRow="0" w:lastRow="0" w:firstColumn="0" w:lastColumn="0" w:oddVBand="0" w:evenVBand="0" w:oddHBand="1" w:evenHBand="0" w:firstRowFirstColumn="0" w:firstRowLastColumn="0" w:lastRowFirstColumn="0" w:lastRowLastColumn="0"/>
+              <w:rPr>
+                <w:sz w:val="16"/>
+                <w:szCs w:val="16"/>
+              </w:rPr>
+            </w:pPr>
+            <w:r>
+              <w:rPr>
+                <w:sz w:val="16"/>
+                <w:szCs w:val="16"/>
+              </w:rPr>
+              <w:t>2,001</w:t>
             </w:r>
           </w:p>
         </w:tc>
@@ -11552,18 +11531,18 @@
           <w:p>
             <w:pPr>
               <w:jc w:val="right"/>
-              <w:cnfStyle w:val="000000100000" w:oddHBand="1"/>
-              <w:rPr>
-                <w:sz w:val="16"/>
-                <w:szCs w:val="16"/>
-              </w:rPr>
-            </w:pPr>
-            <w:r>
-              <w:rPr>
-                <w:sz w:val="16"/>
-                <w:szCs w:val="16"/>
-              </w:rPr>
-              <w:t xml:space="preserve">0,758</w:t>
+              <w:cnfStyle w:val="000000100000" w:firstRow="0" w:lastRow="0" w:firstColumn="0" w:lastColumn="0" w:oddVBand="0" w:evenVBand="0" w:oddHBand="1" w:evenHBand="0" w:firstRowFirstColumn="0" w:firstRowLastColumn="0" w:lastRowFirstColumn="0" w:lastRowLastColumn="0"/>
+              <w:rPr>
+                <w:sz w:val="16"/>
+                <w:szCs w:val="16"/>
+              </w:rPr>
+            </w:pPr>
+            <w:r>
+              <w:rPr>
+                <w:sz w:val="16"/>
+                <w:szCs w:val="16"/>
+              </w:rPr>
+              <w:t>0,758</w:t>
             </w:r>
           </w:p>
         </w:tc>
@@ -11574,27 +11553,26 @@
           <w:p>
             <w:pPr>
               <w:jc w:val="right"/>
-              <w:cnfStyle w:val="000000100000" w:oddHBand="1"/>
-              <w:rPr>
-                <w:sz w:val="16"/>
-                <w:szCs w:val="16"/>
-              </w:rPr>
-            </w:pPr>
-            <w:r>
-              <w:rPr>
-                <w:sz w:val="16"/>
-                <w:szCs w:val="16"/>
-              </w:rPr>
-              <w:t xml:space="preserve">2,501</w:t>
+              <w:cnfStyle w:val="000000100000" w:firstRow="0" w:lastRow="0" w:firstColumn="0" w:lastColumn="0" w:oddVBand="0" w:evenVBand="0" w:oddHBand="1" w:evenHBand="0" w:firstRowFirstColumn="0" w:firstRowLastColumn="0" w:lastRowFirstColumn="0" w:lastRowLastColumn="0"/>
+              <w:rPr>
+                <w:sz w:val="16"/>
+                <w:szCs w:val="16"/>
+              </w:rPr>
+            </w:pPr>
+            <w:r>
+              <w:rPr>
+                <w:sz w:val="16"/>
+                <w:szCs w:val="16"/>
+              </w:rPr>
+              <w:t>2,501</w:t>
             </w:r>
           </w:p>
         </w:tc>
       </w:tr>
       <w:tr>
-        <w:trPr/>
-        <w:tc>
-          <w:tcPr>
-            <w:cnfStyle w:val="001000000000" w:firstColumn="1"/>
+        <w:tc>
+          <w:tcPr>
+            <w:cnfStyle w:val="001000000000" w:firstRow="0" w:lastRow="0" w:firstColumn="1" w:lastColumn="0" w:oddVBand="0" w:evenVBand="0" w:oddHBand="0" w:evenHBand="0" w:firstRowFirstColumn="0" w:firstRowLastColumn="0" w:lastRowFirstColumn="0" w:lastRowLastColumn="0"/>
             <w:tcW w:w="1078" w:type="dxa"/>
           </w:tcPr>
           <w:p>
@@ -11609,7 +11587,7 @@
                 <w:sz w:val="16"/>
                 <w:szCs w:val="16"/>
               </w:rPr>
-              <w:t xml:space="preserve">500</w:t>
+              <w:t>500</w:t>
             </w:r>
           </w:p>
         </w:tc>
@@ -11620,17 +11598,18 @@
           <w:p>
             <w:pPr>
               <w:jc w:val="right"/>
-              <w:rPr>
-                <w:sz w:val="16"/>
-                <w:szCs w:val="16"/>
-              </w:rPr>
-            </w:pPr>
-            <w:r>
-              <w:rPr>
-                <w:sz w:val="16"/>
-                <w:szCs w:val="16"/>
-              </w:rPr>
-              <w:t xml:space="preserve">3,016</w:t>
+              <w:cnfStyle w:val="000000000000" w:firstRow="0" w:lastRow="0" w:firstColumn="0" w:lastColumn="0" w:oddVBand="0" w:evenVBand="0" w:oddHBand="0" w:evenHBand="0" w:firstRowFirstColumn="0" w:firstRowLastColumn="0" w:lastRowFirstColumn="0" w:lastRowLastColumn="0"/>
+              <w:rPr>
+                <w:sz w:val="16"/>
+                <w:szCs w:val="16"/>
+              </w:rPr>
+            </w:pPr>
+            <w:r>
+              <w:rPr>
+                <w:sz w:val="16"/>
+                <w:szCs w:val="16"/>
+              </w:rPr>
+              <w:t>3,016</w:t>
             </w:r>
           </w:p>
         </w:tc>
@@ -11641,17 +11620,18 @@
           <w:p>
             <w:pPr>
               <w:jc w:val="right"/>
-              <w:rPr>
-                <w:sz w:val="16"/>
-                <w:szCs w:val="16"/>
-              </w:rPr>
-            </w:pPr>
-            <w:r>
-              <w:rPr>
-                <w:sz w:val="16"/>
-                <w:szCs w:val="16"/>
-              </w:rPr>
-              <w:t xml:space="preserve">2,866</w:t>
+              <w:cnfStyle w:val="000000000000" w:firstRow="0" w:lastRow="0" w:firstColumn="0" w:lastColumn="0" w:oddVBand="0" w:evenVBand="0" w:oddHBand="0" w:evenHBand="0" w:firstRowFirstColumn="0" w:firstRowLastColumn="0" w:lastRowFirstColumn="0" w:lastRowLastColumn="0"/>
+              <w:rPr>
+                <w:sz w:val="16"/>
+                <w:szCs w:val="16"/>
+              </w:rPr>
+            </w:pPr>
+            <w:r>
+              <w:rPr>
+                <w:sz w:val="16"/>
+                <w:szCs w:val="16"/>
+              </w:rPr>
+              <w:t>2,866</w:t>
             </w:r>
           </w:p>
         </w:tc>
@@ -11662,17 +11642,18 @@
           <w:p>
             <w:pPr>
               <w:jc w:val="right"/>
-              <w:rPr>
-                <w:sz w:val="16"/>
-                <w:szCs w:val="16"/>
-              </w:rPr>
-            </w:pPr>
-            <w:r>
-              <w:rPr>
-                <w:sz w:val="16"/>
-                <w:szCs w:val="16"/>
-              </w:rPr>
-              <w:t xml:space="preserve">3,657</w:t>
+              <w:cnfStyle w:val="000000000000" w:firstRow="0" w:lastRow="0" w:firstColumn="0" w:lastColumn="0" w:oddVBand="0" w:evenVBand="0" w:oddHBand="0" w:evenHBand="0" w:firstRowFirstColumn="0" w:firstRowLastColumn="0" w:lastRowFirstColumn="0" w:lastRowLastColumn="0"/>
+              <w:rPr>
+                <w:sz w:val="16"/>
+                <w:szCs w:val="16"/>
+              </w:rPr>
+            </w:pPr>
+            <w:r>
+              <w:rPr>
+                <w:sz w:val="16"/>
+                <w:szCs w:val="16"/>
+              </w:rPr>
+              <w:t>3,657</w:t>
             </w:r>
           </w:p>
         </w:tc>
@@ -11683,17 +11664,18 @@
           <w:p>
             <w:pPr>
               <w:jc w:val="right"/>
-              <w:rPr>
-                <w:sz w:val="16"/>
-                <w:szCs w:val="16"/>
-              </w:rPr>
-            </w:pPr>
-            <w:r>
-              <w:rPr>
-                <w:sz w:val="16"/>
-                <w:szCs w:val="16"/>
-              </w:rPr>
-              <w:t xml:space="preserve">3,807</w:t>
+              <w:cnfStyle w:val="000000000000" w:firstRow="0" w:lastRow="0" w:firstColumn="0" w:lastColumn="0" w:oddVBand="0" w:evenVBand="0" w:oddHBand="0" w:evenHBand="0" w:firstRowFirstColumn="0" w:firstRowLastColumn="0" w:lastRowFirstColumn="0" w:lastRowLastColumn="0"/>
+              <w:rPr>
+                <w:sz w:val="16"/>
+                <w:szCs w:val="16"/>
+              </w:rPr>
+            </w:pPr>
+            <w:r>
+              <w:rPr>
+                <w:sz w:val="16"/>
+                <w:szCs w:val="16"/>
+              </w:rPr>
+              <w:t>3,807</w:t>
             </w:r>
           </w:p>
         </w:tc>
@@ -11704,17 +11686,18 @@
           <w:p>
             <w:pPr>
               <w:jc w:val="right"/>
-              <w:rPr>
-                <w:sz w:val="16"/>
-                <w:szCs w:val="16"/>
-              </w:rPr>
-            </w:pPr>
-            <w:r>
-              <w:rPr>
-                <w:sz w:val="16"/>
-                <w:szCs w:val="16"/>
-              </w:rPr>
-              <w:t xml:space="preserve">4,270</w:t>
+              <w:cnfStyle w:val="000000000000" w:firstRow="0" w:lastRow="0" w:firstColumn="0" w:lastColumn="0" w:oddVBand="0" w:evenVBand="0" w:oddHBand="0" w:evenHBand="0" w:firstRowFirstColumn="0" w:firstRowLastColumn="0" w:lastRowFirstColumn="0" w:lastRowLastColumn="0"/>
+              <w:rPr>
+                <w:sz w:val="16"/>
+                <w:szCs w:val="16"/>
+              </w:rPr>
+            </w:pPr>
+            <w:r>
+              <w:rPr>
+                <w:sz w:val="16"/>
+                <w:szCs w:val="16"/>
+              </w:rPr>
+              <w:t>4,270</w:t>
             </w:r>
           </w:p>
         </w:tc>
@@ -11725,17 +11708,18 @@
           <w:p>
             <w:pPr>
               <w:jc w:val="right"/>
-              <w:rPr>
-                <w:sz w:val="16"/>
-                <w:szCs w:val="16"/>
-              </w:rPr>
-            </w:pPr>
-            <w:r>
-              <w:rPr>
-                <w:sz w:val="16"/>
-                <w:szCs w:val="16"/>
-              </w:rPr>
-              <w:t xml:space="preserve">1,010</w:t>
+              <w:cnfStyle w:val="000000000000" w:firstRow="0" w:lastRow="0" w:firstColumn="0" w:lastColumn="0" w:oddVBand="0" w:evenVBand="0" w:oddHBand="0" w:evenHBand="0" w:firstRowFirstColumn="0" w:firstRowLastColumn="0" w:lastRowFirstColumn="0" w:lastRowLastColumn="0"/>
+              <w:rPr>
+                <w:sz w:val="16"/>
+                <w:szCs w:val="16"/>
+              </w:rPr>
+            </w:pPr>
+            <w:r>
+              <w:rPr>
+                <w:sz w:val="16"/>
+                <w:szCs w:val="16"/>
+              </w:rPr>
+              <w:t>1,010</w:t>
             </w:r>
           </w:p>
         </w:tc>
@@ -11746,28 +11730,29 @@
           <w:p>
             <w:pPr>
               <w:jc w:val="right"/>
-              <w:rPr>
-                <w:sz w:val="16"/>
-                <w:szCs w:val="16"/>
-              </w:rPr>
-            </w:pPr>
-            <w:r>
-              <w:rPr>
-                <w:sz w:val="16"/>
-                <w:szCs w:val="16"/>
-              </w:rPr>
-              <w:t xml:space="preserve">3,242</w:t>
+              <w:cnfStyle w:val="000000000000" w:firstRow="0" w:lastRow="0" w:firstColumn="0" w:lastColumn="0" w:oddVBand="0" w:evenVBand="0" w:oddHBand="0" w:evenHBand="0" w:firstRowFirstColumn="0" w:firstRowLastColumn="0" w:lastRowFirstColumn="0" w:lastRowLastColumn="0"/>
+              <w:rPr>
+                <w:sz w:val="16"/>
+                <w:szCs w:val="16"/>
+              </w:rPr>
+            </w:pPr>
+            <w:r>
+              <w:rPr>
+                <w:sz w:val="16"/>
+                <w:szCs w:val="16"/>
+              </w:rPr>
+              <w:t>3,242</w:t>
             </w:r>
           </w:p>
         </w:tc>
       </w:tr>
       <w:tr>
         <w:trPr>
-          <w:cnfStyle w:val="000000100000" w:oddHBand="1"/>
+          <w:cnfStyle w:val="000000100000" w:firstRow="0" w:lastRow="0" w:firstColumn="0" w:lastColumn="0" w:oddVBand="0" w:evenVBand="0" w:oddHBand="1" w:evenHBand="0" w:firstRowFirstColumn="0" w:firstRowLastColumn="0" w:lastRowFirstColumn="0" w:lastRowLastColumn="0"/>
         </w:trPr>
         <w:tc>
           <w:tcPr>
-            <w:cnfStyle w:val="001000000000" w:firstColumn="1"/>
+            <w:cnfStyle w:val="001000000000" w:firstRow="0" w:lastRow="0" w:firstColumn="1" w:lastColumn="0" w:oddVBand="0" w:evenVBand="0" w:oddHBand="0" w:evenHBand="0" w:firstRowFirstColumn="0" w:firstRowLastColumn="0" w:lastRowFirstColumn="0" w:lastRowLastColumn="0"/>
             <w:tcW w:w="1078" w:type="dxa"/>
           </w:tcPr>
           <w:p>
@@ -11782,7 +11767,7 @@
                 <w:sz w:val="16"/>
                 <w:szCs w:val="16"/>
               </w:rPr>
-              <w:t xml:space="preserve">1.000</w:t>
+              <w:t>1.000</w:t>
             </w:r>
           </w:p>
         </w:tc>
@@ -11793,18 +11778,18 @@
           <w:p>
             <w:pPr>
               <w:jc w:val="right"/>
-              <w:cnfStyle w:val="000000100000" w:oddHBand="1"/>
-              <w:rPr>
-                <w:sz w:val="16"/>
-                <w:szCs w:val="16"/>
-              </w:rPr>
-            </w:pPr>
-            <w:r>
-              <w:rPr>
-                <w:sz w:val="16"/>
-                <w:szCs w:val="16"/>
-              </w:rPr>
-              <w:t xml:space="preserve">0,885</w:t>
+              <w:cnfStyle w:val="000000100000" w:firstRow="0" w:lastRow="0" w:firstColumn="0" w:lastColumn="0" w:oddVBand="0" w:evenVBand="0" w:oddHBand="1" w:evenHBand="0" w:firstRowFirstColumn="0" w:firstRowLastColumn="0" w:lastRowFirstColumn="0" w:lastRowLastColumn="0"/>
+              <w:rPr>
+                <w:sz w:val="16"/>
+                <w:szCs w:val="16"/>
+              </w:rPr>
+            </w:pPr>
+            <w:r>
+              <w:rPr>
+                <w:sz w:val="16"/>
+                <w:szCs w:val="16"/>
+              </w:rPr>
+              <w:t>0,885</w:t>
             </w:r>
           </w:p>
         </w:tc>
@@ -11815,18 +11800,18 @@
           <w:p>
             <w:pPr>
               <w:jc w:val="right"/>
-              <w:cnfStyle w:val="000000100000" w:oddHBand="1"/>
-              <w:rPr>
-                <w:sz w:val="16"/>
-                <w:szCs w:val="16"/>
-              </w:rPr>
-            </w:pPr>
-            <w:r>
-              <w:rPr>
-                <w:sz w:val="16"/>
-                <w:szCs w:val="16"/>
-              </w:rPr>
-              <w:t xml:space="preserve">1,654</w:t>
+              <w:cnfStyle w:val="000000100000" w:firstRow="0" w:lastRow="0" w:firstColumn="0" w:lastColumn="0" w:oddVBand="0" w:evenVBand="0" w:oddHBand="1" w:evenHBand="0" w:firstRowFirstColumn="0" w:firstRowLastColumn="0" w:lastRowFirstColumn="0" w:lastRowLastColumn="0"/>
+              <w:rPr>
+                <w:sz w:val="16"/>
+                <w:szCs w:val="16"/>
+              </w:rPr>
+            </w:pPr>
+            <w:r>
+              <w:rPr>
+                <w:sz w:val="16"/>
+                <w:szCs w:val="16"/>
+              </w:rPr>
+              <w:t>1,654</w:t>
             </w:r>
           </w:p>
         </w:tc>
@@ -11837,18 +11822,18 @@
           <w:p>
             <w:pPr>
               <w:jc w:val="right"/>
-              <w:cnfStyle w:val="000000100000" w:oddHBand="1"/>
-              <w:rPr>
-                <w:sz w:val="16"/>
-                <w:szCs w:val="16"/>
-              </w:rPr>
-            </w:pPr>
-            <w:r>
-              <w:rPr>
-                <w:sz w:val="16"/>
-                <w:szCs w:val="16"/>
-              </w:rPr>
-              <w:t xml:space="preserve">2,039</w:t>
+              <w:cnfStyle w:val="000000100000" w:firstRow="0" w:lastRow="0" w:firstColumn="0" w:lastColumn="0" w:oddVBand="0" w:evenVBand="0" w:oddHBand="1" w:evenHBand="0" w:firstRowFirstColumn="0" w:firstRowLastColumn="0" w:lastRowFirstColumn="0" w:lastRowLastColumn="0"/>
+              <w:rPr>
+                <w:sz w:val="16"/>
+                <w:szCs w:val="16"/>
+              </w:rPr>
+            </w:pPr>
+            <w:r>
+              <w:rPr>
+                <w:sz w:val="16"/>
+                <w:szCs w:val="16"/>
+              </w:rPr>
+              <w:t>2,039</w:t>
             </w:r>
           </w:p>
         </w:tc>
@@ -11859,18 +11844,18 @@
           <w:p>
             <w:pPr>
               <w:jc w:val="right"/>
-              <w:cnfStyle w:val="000000100000" w:oddHBand="1"/>
-              <w:rPr>
-                <w:sz w:val="16"/>
-                <w:szCs w:val="16"/>
-              </w:rPr>
-            </w:pPr>
-            <w:r>
-              <w:rPr>
-                <w:sz w:val="16"/>
-                <w:szCs w:val="16"/>
-              </w:rPr>
-              <w:t xml:space="preserve">2,171</w:t>
+              <w:cnfStyle w:val="000000100000" w:firstRow="0" w:lastRow="0" w:firstColumn="0" w:lastColumn="0" w:oddVBand="0" w:evenVBand="0" w:oddHBand="1" w:evenHBand="0" w:firstRowFirstColumn="0" w:firstRowLastColumn="0" w:lastRowFirstColumn="0" w:lastRowLastColumn="0"/>
+              <w:rPr>
+                <w:sz w:val="16"/>
+                <w:szCs w:val="16"/>
+              </w:rPr>
+            </w:pPr>
+            <w:r>
+              <w:rPr>
+                <w:sz w:val="16"/>
+                <w:szCs w:val="16"/>
+              </w:rPr>
+              <w:t>2,171</w:t>
             </w:r>
           </w:p>
         </w:tc>
@@ -11881,18 +11866,18 @@
           <w:p>
             <w:pPr>
               <w:jc w:val="right"/>
-              <w:cnfStyle w:val="000000100000" w:oddHBand="1"/>
-              <w:rPr>
-                <w:sz w:val="16"/>
-                <w:szCs w:val="16"/>
-              </w:rPr>
-            </w:pPr>
-            <w:r>
-              <w:rPr>
-                <w:sz w:val="16"/>
-                <w:szCs w:val="16"/>
-              </w:rPr>
-              <w:t xml:space="preserve">3,047</w:t>
+              <w:cnfStyle w:val="000000100000" w:firstRow="0" w:lastRow="0" w:firstColumn="0" w:lastColumn="0" w:oddVBand="0" w:evenVBand="0" w:oddHBand="1" w:evenHBand="0" w:firstRowFirstColumn="0" w:firstRowLastColumn="0" w:lastRowFirstColumn="0" w:lastRowLastColumn="0"/>
+              <w:rPr>
+                <w:sz w:val="16"/>
+                <w:szCs w:val="16"/>
+              </w:rPr>
+            </w:pPr>
+            <w:r>
+              <w:rPr>
+                <w:sz w:val="16"/>
+                <w:szCs w:val="16"/>
+              </w:rPr>
+              <w:t>3,047</w:t>
             </w:r>
           </w:p>
         </w:tc>
@@ -11903,18 +11888,18 @@
           <w:p>
             <w:pPr>
               <w:jc w:val="right"/>
-              <w:cnfStyle w:val="000000100000" w:oddHBand="1"/>
-              <w:rPr>
-                <w:sz w:val="16"/>
-                <w:szCs w:val="16"/>
-              </w:rPr>
-            </w:pPr>
-            <w:r>
-              <w:rPr>
-                <w:sz w:val="16"/>
-                <w:szCs w:val="16"/>
-              </w:rPr>
-              <w:t xml:space="preserve">0,904</w:t>
+              <w:cnfStyle w:val="000000100000" w:firstRow="0" w:lastRow="0" w:firstColumn="0" w:lastColumn="0" w:oddVBand="0" w:evenVBand="0" w:oddHBand="1" w:evenHBand="0" w:firstRowFirstColumn="0" w:firstRowLastColumn="0" w:lastRowFirstColumn="0" w:lastRowLastColumn="0"/>
+              <w:rPr>
+                <w:sz w:val="16"/>
+                <w:szCs w:val="16"/>
+              </w:rPr>
+            </w:pPr>
+            <w:r>
+              <w:rPr>
+                <w:sz w:val="16"/>
+                <w:szCs w:val="16"/>
+              </w:rPr>
+              <w:t>0,904</w:t>
             </w:r>
           </w:p>
         </w:tc>
@@ -11925,27 +11910,26 @@
           <w:p>
             <w:pPr>
               <w:jc w:val="right"/>
-              <w:cnfStyle w:val="000000100000" w:oddHBand="1"/>
-              <w:rPr>
-                <w:sz w:val="16"/>
-                <w:szCs w:val="16"/>
-              </w:rPr>
-            </w:pPr>
-            <w:r>
-              <w:rPr>
-                <w:sz w:val="16"/>
-                <w:szCs w:val="16"/>
-              </w:rPr>
-              <w:t xml:space="preserve">1,856</w:t>
+              <w:cnfStyle w:val="000000100000" w:firstRow="0" w:lastRow="0" w:firstColumn="0" w:lastColumn="0" w:oddVBand="0" w:evenVBand="0" w:oddHBand="1" w:evenHBand="0" w:firstRowFirstColumn="0" w:firstRowLastColumn="0" w:lastRowFirstColumn="0" w:lastRowLastColumn="0"/>
+              <w:rPr>
+                <w:sz w:val="16"/>
+                <w:szCs w:val="16"/>
+              </w:rPr>
+            </w:pPr>
+            <w:r>
+              <w:rPr>
+                <w:sz w:val="16"/>
+                <w:szCs w:val="16"/>
+              </w:rPr>
+              <w:t>1,856</w:t>
             </w:r>
           </w:p>
         </w:tc>
       </w:tr>
       <w:tr>
-        <w:trPr/>
-        <w:tc>
-          <w:tcPr>
-            <w:cnfStyle w:val="001000000000" w:firstColumn="1"/>
+        <w:tc>
+          <w:tcPr>
+            <w:cnfStyle w:val="001000000000" w:firstRow="0" w:lastRow="0" w:firstColumn="1" w:lastColumn="0" w:oddVBand="0" w:evenVBand="0" w:oddHBand="0" w:evenHBand="0" w:firstRowFirstColumn="0" w:firstRowLastColumn="0" w:lastRowFirstColumn="0" w:lastRowLastColumn="0"/>
             <w:tcW w:w="1078" w:type="dxa"/>
           </w:tcPr>
           <w:p>
@@ -11960,7 +11944,7 @@
                 <w:sz w:val="16"/>
                 <w:szCs w:val="16"/>
               </w:rPr>
-              <w:t xml:space="preserve">2.000</w:t>
+              <w:t>2.000</w:t>
             </w:r>
           </w:p>
         </w:tc>
@@ -11971,17 +11955,18 @@
           <w:p>
             <w:pPr>
               <w:jc w:val="right"/>
-              <w:rPr>
-                <w:sz w:val="16"/>
-                <w:szCs w:val="16"/>
-              </w:rPr>
-            </w:pPr>
-            <w:r>
-              <w:rPr>
-                <w:sz w:val="16"/>
-                <w:szCs w:val="16"/>
-              </w:rPr>
-              <w:t xml:space="preserve">0,979</w:t>
+              <w:cnfStyle w:val="000000000000" w:firstRow="0" w:lastRow="0" w:firstColumn="0" w:lastColumn="0" w:oddVBand="0" w:evenVBand="0" w:oddHBand="0" w:evenHBand="0" w:firstRowFirstColumn="0" w:firstRowLastColumn="0" w:lastRowFirstColumn="0" w:lastRowLastColumn="0"/>
+              <w:rPr>
+                <w:sz w:val="16"/>
+                <w:szCs w:val="16"/>
+              </w:rPr>
+            </w:pPr>
+            <w:r>
+              <w:rPr>
+                <w:sz w:val="16"/>
+                <w:szCs w:val="16"/>
+              </w:rPr>
+              <w:t>0,979</w:t>
             </w:r>
           </w:p>
         </w:tc>
@@ -11992,17 +11977,18 @@
           <w:p>
             <w:pPr>
               <w:jc w:val="right"/>
-              <w:rPr>
-                <w:sz w:val="16"/>
-                <w:szCs w:val="16"/>
-              </w:rPr>
-            </w:pPr>
-            <w:r>
-              <w:rPr>
-                <w:sz w:val="16"/>
-                <w:szCs w:val="16"/>
-              </w:rPr>
-              <w:t xml:space="preserve">1,728</w:t>
+              <w:cnfStyle w:val="000000000000" w:firstRow="0" w:lastRow="0" w:firstColumn="0" w:lastColumn="0" w:oddVBand="0" w:evenVBand="0" w:oddHBand="0" w:evenHBand="0" w:firstRowFirstColumn="0" w:firstRowLastColumn="0" w:lastRowFirstColumn="0" w:lastRowLastColumn="0"/>
+              <w:rPr>
+                <w:sz w:val="16"/>
+                <w:szCs w:val="16"/>
+              </w:rPr>
+            </w:pPr>
+            <w:r>
+              <w:rPr>
+                <w:sz w:val="16"/>
+                <w:szCs w:val="16"/>
+              </w:rPr>
+              <w:t>1,728</w:t>
             </w:r>
           </w:p>
         </w:tc>
@@ -12013,17 +11999,18 @@
           <w:p>
             <w:pPr>
               <w:jc w:val="right"/>
-              <w:rPr>
-                <w:sz w:val="16"/>
-                <w:szCs w:val="16"/>
-              </w:rPr>
-            </w:pPr>
-            <w:r>
-              <w:rPr>
-                <w:sz w:val="16"/>
-                <w:szCs w:val="16"/>
-              </w:rPr>
-              <w:t xml:space="preserve">3,111</w:t>
+              <w:cnfStyle w:val="000000000000" w:firstRow="0" w:lastRow="0" w:firstColumn="0" w:lastColumn="0" w:oddVBand="0" w:evenVBand="0" w:oddHBand="0" w:evenHBand="0" w:firstRowFirstColumn="0" w:firstRowLastColumn="0" w:lastRowFirstColumn="0" w:lastRowLastColumn="0"/>
+              <w:rPr>
+                <w:sz w:val="16"/>
+                <w:szCs w:val="16"/>
+              </w:rPr>
+            </w:pPr>
+            <w:r>
+              <w:rPr>
+                <w:sz w:val="16"/>
+                <w:szCs w:val="16"/>
+              </w:rPr>
+              <w:t>3,111</w:t>
             </w:r>
           </w:p>
         </w:tc>
@@ -12034,17 +12021,18 @@
           <w:p>
             <w:pPr>
               <w:jc w:val="right"/>
-              <w:rPr>
-                <w:sz w:val="16"/>
-                <w:szCs w:val="16"/>
-              </w:rPr>
-            </w:pPr>
-            <w:r>
-              <w:rPr>
-                <w:sz w:val="16"/>
-                <w:szCs w:val="16"/>
-              </w:rPr>
-              <w:t xml:space="preserve">3,313</w:t>
+              <w:cnfStyle w:val="000000000000" w:firstRow="0" w:lastRow="0" w:firstColumn="0" w:lastColumn="0" w:oddVBand="0" w:evenVBand="0" w:oddHBand="0" w:evenHBand="0" w:firstRowFirstColumn="0" w:firstRowLastColumn="0" w:lastRowFirstColumn="0" w:lastRowLastColumn="0"/>
+              <w:rPr>
+                <w:sz w:val="16"/>
+                <w:szCs w:val="16"/>
+              </w:rPr>
+            </w:pPr>
+            <w:r>
+              <w:rPr>
+                <w:sz w:val="16"/>
+                <w:szCs w:val="16"/>
+              </w:rPr>
+              <w:t>3,313</w:t>
             </w:r>
           </w:p>
         </w:tc>
@@ -12055,17 +12043,18 @@
           <w:p>
             <w:pPr>
               <w:jc w:val="right"/>
-              <w:rPr>
-                <w:sz w:val="16"/>
-                <w:szCs w:val="16"/>
-              </w:rPr>
-            </w:pPr>
-            <w:r>
-              <w:rPr>
-                <w:sz w:val="16"/>
-                <w:szCs w:val="16"/>
-              </w:rPr>
-              <w:t xml:space="preserve">2,123</w:t>
+              <w:cnfStyle w:val="000000000000" w:firstRow="0" w:lastRow="0" w:firstColumn="0" w:lastColumn="0" w:oddVBand="0" w:evenVBand="0" w:oddHBand="0" w:evenHBand="0" w:firstRowFirstColumn="0" w:firstRowLastColumn="0" w:lastRowFirstColumn="0" w:lastRowLastColumn="0"/>
+              <w:rPr>
+                <w:sz w:val="16"/>
+                <w:szCs w:val="16"/>
+              </w:rPr>
+            </w:pPr>
+            <w:r>
+              <w:rPr>
+                <w:sz w:val="16"/>
+                <w:szCs w:val="16"/>
+              </w:rPr>
+              <w:t>2,123</w:t>
             </w:r>
           </w:p>
         </w:tc>
@@ -12076,17 +12065,18 @@
           <w:p>
             <w:pPr>
               <w:jc w:val="right"/>
-              <w:rPr>
-                <w:sz w:val="16"/>
-                <w:szCs w:val="16"/>
-              </w:rPr>
-            </w:pPr>
-            <w:r>
-              <w:rPr>
-                <w:sz w:val="16"/>
-                <w:szCs w:val="16"/>
-              </w:rPr>
-              <w:t xml:space="preserve">5,899</w:t>
+              <w:cnfStyle w:val="000000000000" w:firstRow="0" w:lastRow="0" w:firstColumn="0" w:lastColumn="0" w:oddVBand="0" w:evenVBand="0" w:oddHBand="0" w:evenHBand="0" w:firstRowFirstColumn="0" w:firstRowLastColumn="0" w:lastRowFirstColumn="0" w:lastRowLastColumn="0"/>
+              <w:rPr>
+                <w:sz w:val="16"/>
+                <w:szCs w:val="16"/>
+              </w:rPr>
+            </w:pPr>
+            <w:r>
+              <w:rPr>
+                <w:sz w:val="16"/>
+                <w:szCs w:val="16"/>
+              </w:rPr>
+              <w:t>5,899</w:t>
             </w:r>
           </w:p>
         </w:tc>
@@ -12097,28 +12087,29 @@
           <w:p>
             <w:pPr>
               <w:jc w:val="right"/>
-              <w:rPr>
-                <w:sz w:val="16"/>
-                <w:szCs w:val="16"/>
-              </w:rPr>
-            </w:pPr>
-            <w:r>
-              <w:rPr>
-                <w:sz w:val="16"/>
-                <w:szCs w:val="16"/>
-              </w:rPr>
-              <w:t xml:space="preserve">2,623</w:t>
+              <w:cnfStyle w:val="000000000000" w:firstRow="0" w:lastRow="0" w:firstColumn="0" w:lastColumn="0" w:oddVBand="0" w:evenVBand="0" w:oddHBand="0" w:evenHBand="0" w:firstRowFirstColumn="0" w:firstRowLastColumn="0" w:lastRowFirstColumn="0" w:lastRowLastColumn="0"/>
+              <w:rPr>
+                <w:sz w:val="16"/>
+                <w:szCs w:val="16"/>
+              </w:rPr>
+            </w:pPr>
+            <w:r>
+              <w:rPr>
+                <w:sz w:val="16"/>
+                <w:szCs w:val="16"/>
+              </w:rPr>
+              <w:t>2,623</w:t>
             </w:r>
           </w:p>
         </w:tc>
       </w:tr>
       <w:tr>
         <w:trPr>
-          <w:cnfStyle w:val="000000100000" w:oddHBand="1"/>
+          <w:cnfStyle w:val="000000100000" w:firstRow="0" w:lastRow="0" w:firstColumn="0" w:lastColumn="0" w:oddVBand="0" w:evenVBand="0" w:oddHBand="1" w:evenHBand="0" w:firstRowFirstColumn="0" w:firstRowLastColumn="0" w:lastRowFirstColumn="0" w:lastRowLastColumn="0"/>
         </w:trPr>
         <w:tc>
           <w:tcPr>
-            <w:cnfStyle w:val="001000000000" w:firstColumn="1"/>
+            <w:cnfStyle w:val="001000000000" w:firstRow="0" w:lastRow="0" w:firstColumn="1" w:lastColumn="0" w:oddVBand="0" w:evenVBand="0" w:oddHBand="0" w:evenHBand="0" w:firstRowFirstColumn="0" w:firstRowLastColumn="0" w:lastRowFirstColumn="0" w:lastRowLastColumn="0"/>
             <w:tcW w:w="1078" w:type="dxa"/>
           </w:tcPr>
           <w:p>
@@ -12133,7 +12124,7 @@
                 <w:sz w:val="16"/>
                 <w:szCs w:val="16"/>
               </w:rPr>
-              <w:t xml:space="preserve">5.000</w:t>
+              <w:t>5.000</w:t>
             </w:r>
           </w:p>
         </w:tc>
@@ -12144,18 +12135,18 @@
           <w:p>
             <w:pPr>
               <w:jc w:val="right"/>
-              <w:cnfStyle w:val="000000100000" w:oddHBand="1"/>
-              <w:rPr>
-                <w:sz w:val="16"/>
-                <w:szCs w:val="16"/>
-              </w:rPr>
-            </w:pPr>
-            <w:r>
-              <w:rPr>
-                <w:sz w:val="16"/>
-                <w:szCs w:val="16"/>
-              </w:rPr>
-              <w:t xml:space="preserve">0,895</w:t>
+              <w:cnfStyle w:val="000000100000" w:firstRow="0" w:lastRow="0" w:firstColumn="0" w:lastColumn="0" w:oddVBand="0" w:evenVBand="0" w:oddHBand="1" w:evenHBand="0" w:firstRowFirstColumn="0" w:firstRowLastColumn="0" w:lastRowFirstColumn="0" w:lastRowLastColumn="0"/>
+              <w:rPr>
+                <w:sz w:val="16"/>
+                <w:szCs w:val="16"/>
+              </w:rPr>
+            </w:pPr>
+            <w:r>
+              <w:rPr>
+                <w:sz w:val="16"/>
+                <w:szCs w:val="16"/>
+              </w:rPr>
+              <w:t>0,895</w:t>
             </w:r>
           </w:p>
         </w:tc>
@@ -12166,18 +12157,18 @@
           <w:p>
             <w:pPr>
               <w:jc w:val="right"/>
-              <w:cnfStyle w:val="000000100000" w:oddHBand="1"/>
-              <w:rPr>
-                <w:sz w:val="16"/>
-                <w:szCs w:val="16"/>
-              </w:rPr>
-            </w:pPr>
-            <w:r>
-              <w:rPr>
-                <w:sz w:val="16"/>
-                <w:szCs w:val="16"/>
-              </w:rPr>
-              <w:t xml:space="preserve">0,590</w:t>
+              <w:cnfStyle w:val="000000100000" w:firstRow="0" w:lastRow="0" w:firstColumn="0" w:lastColumn="0" w:oddVBand="0" w:evenVBand="0" w:oddHBand="1" w:evenHBand="0" w:firstRowFirstColumn="0" w:firstRowLastColumn="0" w:lastRowFirstColumn="0" w:lastRowLastColumn="0"/>
+              <w:rPr>
+                <w:sz w:val="16"/>
+                <w:szCs w:val="16"/>
+              </w:rPr>
+            </w:pPr>
+            <w:r>
+              <w:rPr>
+                <w:sz w:val="16"/>
+                <w:szCs w:val="16"/>
+              </w:rPr>
+              <w:t>0,590</w:t>
             </w:r>
           </w:p>
         </w:tc>
@@ -12188,18 +12179,18 @@
           <w:p>
             <w:pPr>
               <w:jc w:val="right"/>
-              <w:cnfStyle w:val="000000100000" w:oddHBand="1"/>
-              <w:rPr>
-                <w:sz w:val="16"/>
-                <w:szCs w:val="16"/>
-              </w:rPr>
-            </w:pPr>
-            <w:r>
-              <w:rPr>
-                <w:sz w:val="16"/>
-                <w:szCs w:val="16"/>
-              </w:rPr>
-              <w:t xml:space="preserve">0,879</w:t>
+              <w:cnfStyle w:val="000000100000" w:firstRow="0" w:lastRow="0" w:firstColumn="0" w:lastColumn="0" w:oddVBand="0" w:evenVBand="0" w:oddHBand="1" w:evenHBand="0" w:firstRowFirstColumn="0" w:firstRowLastColumn="0" w:lastRowFirstColumn="0" w:lastRowLastColumn="0"/>
+              <w:rPr>
+                <w:sz w:val="16"/>
+                <w:szCs w:val="16"/>
+              </w:rPr>
+            </w:pPr>
+            <w:r>
+              <w:rPr>
+                <w:sz w:val="16"/>
+                <w:szCs w:val="16"/>
+              </w:rPr>
+              <w:t>0,879</w:t>
             </w:r>
           </w:p>
         </w:tc>
@@ -12210,18 +12201,18 @@
           <w:p>
             <w:pPr>
               <w:jc w:val="right"/>
-              <w:cnfStyle w:val="000000100000" w:oddHBand="1"/>
-              <w:rPr>
-                <w:sz w:val="16"/>
-                <w:szCs w:val="16"/>
-              </w:rPr>
-            </w:pPr>
-            <w:r>
-              <w:rPr>
-                <w:sz w:val="16"/>
-                <w:szCs w:val="16"/>
-              </w:rPr>
-              <w:t xml:space="preserve">0,814</w:t>
+              <w:cnfStyle w:val="000000100000" w:firstRow="0" w:lastRow="0" w:firstColumn="0" w:lastColumn="0" w:oddVBand="0" w:evenVBand="0" w:oddHBand="1" w:evenHBand="0" w:firstRowFirstColumn="0" w:firstRowLastColumn="0" w:lastRowFirstColumn="0" w:lastRowLastColumn="0"/>
+              <w:rPr>
+                <w:sz w:val="16"/>
+                <w:szCs w:val="16"/>
+              </w:rPr>
+            </w:pPr>
+            <w:r>
+              <w:rPr>
+                <w:sz w:val="16"/>
+                <w:szCs w:val="16"/>
+              </w:rPr>
+              <w:t>0,814</w:t>
             </w:r>
           </w:p>
         </w:tc>
@@ -12232,18 +12223,18 @@
           <w:p>
             <w:pPr>
               <w:jc w:val="right"/>
-              <w:cnfStyle w:val="000000100000" w:oddHBand="1"/>
-              <w:rPr>
-                <w:sz w:val="16"/>
-                <w:szCs w:val="16"/>
-              </w:rPr>
-            </w:pPr>
-            <w:r>
-              <w:rPr>
-                <w:sz w:val="16"/>
-                <w:szCs w:val="16"/>
-              </w:rPr>
-              <w:t xml:space="preserve">1,928</w:t>
+              <w:cnfStyle w:val="000000100000" w:firstRow="0" w:lastRow="0" w:firstColumn="0" w:lastColumn="0" w:oddVBand="0" w:evenVBand="0" w:oddHBand="1" w:evenHBand="0" w:firstRowFirstColumn="0" w:firstRowLastColumn="0" w:lastRowFirstColumn="0" w:lastRowLastColumn="0"/>
+              <w:rPr>
+                <w:sz w:val="16"/>
+                <w:szCs w:val="16"/>
+              </w:rPr>
+            </w:pPr>
+            <w:r>
+              <w:rPr>
+                <w:sz w:val="16"/>
+                <w:szCs w:val="16"/>
+              </w:rPr>
+              <w:t>1,928</w:t>
             </w:r>
           </w:p>
         </w:tc>
@@ -12254,18 +12245,18 @@
           <w:p>
             <w:pPr>
               <w:jc w:val="right"/>
-              <w:cnfStyle w:val="000000100000" w:oddHBand="1"/>
-              <w:rPr>
-                <w:sz w:val="16"/>
-                <w:szCs w:val="16"/>
-              </w:rPr>
-            </w:pPr>
-            <w:r>
-              <w:rPr>
-                <w:sz w:val="16"/>
-                <w:szCs w:val="16"/>
-              </w:rPr>
-              <w:t xml:space="preserve">3,504</w:t>
+              <w:cnfStyle w:val="000000100000" w:firstRow="0" w:lastRow="0" w:firstColumn="0" w:lastColumn="0" w:oddVBand="0" w:evenVBand="0" w:oddHBand="1" w:evenHBand="0" w:firstRowFirstColumn="0" w:firstRowLastColumn="0" w:lastRowFirstColumn="0" w:lastRowLastColumn="0"/>
+              <w:rPr>
+                <w:sz w:val="16"/>
+                <w:szCs w:val="16"/>
+              </w:rPr>
+            </w:pPr>
+            <w:r>
+              <w:rPr>
+                <w:sz w:val="16"/>
+                <w:szCs w:val="16"/>
+              </w:rPr>
+              <w:t>3,504</w:t>
             </w:r>
           </w:p>
         </w:tc>
@@ -12276,27 +12267,26 @@
           <w:p>
             <w:pPr>
               <w:jc w:val="right"/>
-              <w:cnfStyle w:val="000000100000" w:oddHBand="1"/>
-              <w:rPr>
-                <w:sz w:val="16"/>
-                <w:szCs w:val="16"/>
-              </w:rPr>
-            </w:pPr>
-            <w:r>
-              <w:rPr>
-                <w:sz w:val="16"/>
-                <w:szCs w:val="16"/>
-              </w:rPr>
-              <w:t xml:space="preserve">1,259</w:t>
+              <w:cnfStyle w:val="000000100000" w:firstRow="0" w:lastRow="0" w:firstColumn="0" w:lastColumn="0" w:oddVBand="0" w:evenVBand="0" w:oddHBand="1" w:evenHBand="0" w:firstRowFirstColumn="0" w:firstRowLastColumn="0" w:lastRowFirstColumn="0" w:lastRowLastColumn="0"/>
+              <w:rPr>
+                <w:sz w:val="16"/>
+                <w:szCs w:val="16"/>
+              </w:rPr>
+            </w:pPr>
+            <w:r>
+              <w:rPr>
+                <w:sz w:val="16"/>
+                <w:szCs w:val="16"/>
+              </w:rPr>
+              <w:t>1,259</w:t>
             </w:r>
           </w:p>
         </w:tc>
       </w:tr>
       <w:tr>
-        <w:trPr/>
-        <w:tc>
-          <w:tcPr>
-            <w:cnfStyle w:val="001000000000" w:firstColumn="1"/>
+        <w:tc>
+          <w:tcPr>
+            <w:cnfStyle w:val="001000000000" w:firstRow="0" w:lastRow="0" w:firstColumn="1" w:lastColumn="0" w:oddVBand="0" w:evenVBand="0" w:oddHBand="0" w:evenHBand="0" w:firstRowFirstColumn="0" w:firstRowLastColumn="0" w:lastRowFirstColumn="0" w:lastRowLastColumn="0"/>
             <w:tcW w:w="1078" w:type="dxa"/>
           </w:tcPr>
           <w:p>
@@ -12311,7 +12301,7 @@
                 <w:sz w:val="16"/>
                 <w:szCs w:val="16"/>
               </w:rPr>
-              <w:t xml:space="preserve">10.000</w:t>
+              <w:t>10.000</w:t>
             </w:r>
           </w:p>
         </w:tc>
@@ -12322,17 +12312,18 @@
           <w:p>
             <w:pPr>
               <w:jc w:val="right"/>
-              <w:rPr>
-                <w:sz w:val="16"/>
-                <w:szCs w:val="16"/>
-              </w:rPr>
-            </w:pPr>
-            <w:r>
-              <w:rPr>
-                <w:sz w:val="16"/>
-                <w:szCs w:val="16"/>
-              </w:rPr>
-              <w:t xml:space="preserve">0,611</w:t>
+              <w:cnfStyle w:val="000000000000" w:firstRow="0" w:lastRow="0" w:firstColumn="0" w:lastColumn="0" w:oddVBand="0" w:evenVBand="0" w:oddHBand="0" w:evenHBand="0" w:firstRowFirstColumn="0" w:firstRowLastColumn="0" w:lastRowFirstColumn="0" w:lastRowLastColumn="0"/>
+              <w:rPr>
+                <w:sz w:val="16"/>
+                <w:szCs w:val="16"/>
+              </w:rPr>
+            </w:pPr>
+            <w:r>
+              <w:rPr>
+                <w:sz w:val="16"/>
+                <w:szCs w:val="16"/>
+              </w:rPr>
+              <w:t>0,611</w:t>
             </w:r>
           </w:p>
         </w:tc>
@@ -12343,17 +12334,18 @@
           <w:p>
             <w:pPr>
               <w:jc w:val="right"/>
-              <w:rPr>
-                <w:sz w:val="16"/>
-                <w:szCs w:val="16"/>
-              </w:rPr>
-            </w:pPr>
-            <w:r>
-              <w:rPr>
-                <w:sz w:val="16"/>
-                <w:szCs w:val="16"/>
-              </w:rPr>
-              <w:t xml:space="preserve">0,815</w:t>
+              <w:cnfStyle w:val="000000000000" w:firstRow="0" w:lastRow="0" w:firstColumn="0" w:lastColumn="0" w:oddVBand="0" w:evenVBand="0" w:oddHBand="0" w:evenHBand="0" w:firstRowFirstColumn="0" w:firstRowLastColumn="0" w:lastRowFirstColumn="0" w:lastRowLastColumn="0"/>
+              <w:rPr>
+                <w:sz w:val="16"/>
+                <w:szCs w:val="16"/>
+              </w:rPr>
+            </w:pPr>
+            <w:r>
+              <w:rPr>
+                <w:sz w:val="16"/>
+                <w:szCs w:val="16"/>
+              </w:rPr>
+              <w:t>0,815</w:t>
             </w:r>
           </w:p>
         </w:tc>
@@ -12364,17 +12356,18 @@
           <w:p>
             <w:pPr>
               <w:jc w:val="right"/>
-              <w:rPr>
-                <w:sz w:val="16"/>
-                <w:szCs w:val="16"/>
-              </w:rPr>
-            </w:pPr>
-            <w:r>
-              <w:rPr>
-                <w:sz w:val="16"/>
-                <w:szCs w:val="16"/>
-              </w:rPr>
-              <w:t xml:space="preserve">0,980</w:t>
+              <w:cnfStyle w:val="000000000000" w:firstRow="0" w:lastRow="0" w:firstColumn="0" w:lastColumn="0" w:oddVBand="0" w:evenVBand="0" w:oddHBand="0" w:evenHBand="0" w:firstRowFirstColumn="0" w:firstRowLastColumn="0" w:lastRowFirstColumn="0" w:lastRowLastColumn="0"/>
+              <w:rPr>
+                <w:sz w:val="16"/>
+                <w:szCs w:val="16"/>
+              </w:rPr>
+            </w:pPr>
+            <w:r>
+              <w:rPr>
+                <w:sz w:val="16"/>
+                <w:szCs w:val="16"/>
+              </w:rPr>
+              <w:t>0,980</w:t>
             </w:r>
           </w:p>
         </w:tc>
@@ -12385,17 +12378,18 @@
           <w:p>
             <w:pPr>
               <w:jc w:val="right"/>
-              <w:rPr>
-                <w:sz w:val="16"/>
-                <w:szCs w:val="16"/>
-              </w:rPr>
-            </w:pPr>
-            <w:r>
-              <w:rPr>
-                <w:sz w:val="16"/>
-                <w:szCs w:val="16"/>
-              </w:rPr>
-              <w:t xml:space="preserve">1,119</w:t>
+              <w:cnfStyle w:val="000000000000" w:firstRow="0" w:lastRow="0" w:firstColumn="0" w:lastColumn="0" w:oddVBand="0" w:evenVBand="0" w:oddHBand="0" w:evenHBand="0" w:firstRowFirstColumn="0" w:firstRowLastColumn="0" w:lastRowFirstColumn="0" w:lastRowLastColumn="0"/>
+              <w:rPr>
+                <w:sz w:val="16"/>
+                <w:szCs w:val="16"/>
+              </w:rPr>
+            </w:pPr>
+            <w:r>
+              <w:rPr>
+                <w:sz w:val="16"/>
+                <w:szCs w:val="16"/>
+              </w:rPr>
+              <w:t>1,119</w:t>
             </w:r>
           </w:p>
         </w:tc>
@@ -12406,17 +12400,18 @@
           <w:p>
             <w:pPr>
               <w:jc w:val="right"/>
-              <w:rPr>
-                <w:sz w:val="16"/>
-                <w:szCs w:val="16"/>
-              </w:rPr>
-            </w:pPr>
-            <w:r>
-              <w:rPr>
-                <w:sz w:val="16"/>
-                <w:szCs w:val="16"/>
-              </w:rPr>
-              <w:t xml:space="preserve">2,621</w:t>
+              <w:cnfStyle w:val="000000000000" w:firstRow="0" w:lastRow="0" w:firstColumn="0" w:lastColumn="0" w:oddVBand="0" w:evenVBand="0" w:oddHBand="0" w:evenHBand="0" w:firstRowFirstColumn="0" w:firstRowLastColumn="0" w:lastRowFirstColumn="0" w:lastRowLastColumn="0"/>
+              <w:rPr>
+                <w:sz w:val="16"/>
+                <w:szCs w:val="16"/>
+              </w:rPr>
+            </w:pPr>
+            <w:r>
+              <w:rPr>
+                <w:sz w:val="16"/>
+                <w:szCs w:val="16"/>
+              </w:rPr>
+              <w:t>2,621</w:t>
             </w:r>
           </w:p>
         </w:tc>
@@ -12427,17 +12422,18 @@
           <w:p>
             <w:pPr>
               <w:jc w:val="right"/>
-              <w:rPr>
-                <w:sz w:val="16"/>
-                <w:szCs w:val="16"/>
-              </w:rPr>
-            </w:pPr>
-            <w:r>
-              <w:rPr>
-                <w:sz w:val="16"/>
-                <w:szCs w:val="16"/>
-              </w:rPr>
-              <w:t xml:space="preserve">1,780</w:t>
+              <w:cnfStyle w:val="000000000000" w:firstRow="0" w:lastRow="0" w:firstColumn="0" w:lastColumn="0" w:oddVBand="0" w:evenVBand="0" w:oddHBand="0" w:evenHBand="0" w:firstRowFirstColumn="0" w:firstRowLastColumn="0" w:lastRowFirstColumn="0" w:lastRowLastColumn="0"/>
+              <w:rPr>
+                <w:sz w:val="16"/>
+                <w:szCs w:val="16"/>
+              </w:rPr>
+            </w:pPr>
+            <w:r>
+              <w:rPr>
+                <w:sz w:val="16"/>
+                <w:szCs w:val="16"/>
+              </w:rPr>
+              <w:t>1,780</w:t>
             </w:r>
           </w:p>
         </w:tc>
@@ -12448,28 +12444,29 @@
           <w:p>
             <w:pPr>
               <w:jc w:val="right"/>
-              <w:rPr>
-                <w:sz w:val="16"/>
-                <w:szCs w:val="16"/>
-              </w:rPr>
-            </w:pPr>
-            <w:r>
-              <w:rPr>
-                <w:sz w:val="16"/>
-                <w:szCs w:val="16"/>
-              </w:rPr>
-              <w:t xml:space="preserve">1,297</w:t>
+              <w:cnfStyle w:val="000000000000" w:firstRow="0" w:lastRow="0" w:firstColumn="0" w:lastColumn="0" w:oddVBand="0" w:evenVBand="0" w:oddHBand="0" w:evenHBand="0" w:firstRowFirstColumn="0" w:firstRowLastColumn="0" w:lastRowFirstColumn="0" w:lastRowLastColumn="0"/>
+              <w:rPr>
+                <w:sz w:val="16"/>
+                <w:szCs w:val="16"/>
+              </w:rPr>
+            </w:pPr>
+            <w:r>
+              <w:rPr>
+                <w:sz w:val="16"/>
+                <w:szCs w:val="16"/>
+              </w:rPr>
+              <w:t>1,297</w:t>
             </w:r>
           </w:p>
         </w:tc>
       </w:tr>
       <w:tr>
         <w:trPr>
-          <w:cnfStyle w:val="000000100000" w:oddHBand="1"/>
+          <w:cnfStyle w:val="000000100000" w:firstRow="0" w:lastRow="0" w:firstColumn="0" w:lastColumn="0" w:oddVBand="0" w:evenVBand="0" w:oddHBand="1" w:evenHBand="0" w:firstRowFirstColumn="0" w:firstRowLastColumn="0" w:lastRowFirstColumn="0" w:lastRowLastColumn="0"/>
         </w:trPr>
         <w:tc>
           <w:tcPr>
-            <w:cnfStyle w:val="001000000000" w:firstColumn="1"/>
+            <w:cnfStyle w:val="001000000000" w:firstRow="0" w:lastRow="0" w:firstColumn="1" w:lastColumn="0" w:oddVBand="0" w:evenVBand="0" w:oddHBand="0" w:evenHBand="0" w:firstRowFirstColumn="0" w:firstRowLastColumn="0" w:lastRowFirstColumn="0" w:lastRowLastColumn="0"/>
             <w:tcW w:w="1078" w:type="dxa"/>
           </w:tcPr>
           <w:p>
@@ -12484,7 +12481,7 @@
                 <w:sz w:val="16"/>
                 <w:szCs w:val="16"/>
               </w:rPr>
-              <w:t xml:space="preserve">20.000</w:t>
+              <w:t>20.000</w:t>
             </w:r>
           </w:p>
         </w:tc>
@@ -12495,18 +12492,18 @@
           <w:p>
             <w:pPr>
               <w:jc w:val="right"/>
-              <w:cnfStyle w:val="000000100000" w:oddHBand="1"/>
-              <w:rPr>
-                <w:sz w:val="16"/>
-                <w:szCs w:val="16"/>
-              </w:rPr>
-            </w:pPr>
-            <w:r>
-              <w:rPr>
-                <w:sz w:val="16"/>
-                <w:szCs w:val="16"/>
-              </w:rPr>
-              <w:t xml:space="preserve">0,381</w:t>
+              <w:cnfStyle w:val="000000100000" w:firstRow="0" w:lastRow="0" w:firstColumn="0" w:lastColumn="0" w:oddVBand="0" w:evenVBand="0" w:oddHBand="1" w:evenHBand="0" w:firstRowFirstColumn="0" w:firstRowLastColumn="0" w:lastRowFirstColumn="0" w:lastRowLastColumn="0"/>
+              <w:rPr>
+                <w:sz w:val="16"/>
+                <w:szCs w:val="16"/>
+              </w:rPr>
+            </w:pPr>
+            <w:r>
+              <w:rPr>
+                <w:sz w:val="16"/>
+                <w:szCs w:val="16"/>
+              </w:rPr>
+              <w:t>0,381</w:t>
             </w:r>
           </w:p>
         </w:tc>
@@ -12517,18 +12514,18 @@
           <w:p>
             <w:pPr>
               <w:jc w:val="right"/>
-              <w:cnfStyle w:val="000000100000" w:oddHBand="1"/>
-              <w:rPr>
-                <w:sz w:val="16"/>
-                <w:szCs w:val="16"/>
-              </w:rPr>
-            </w:pPr>
-            <w:r>
-              <w:rPr>
-                <w:sz w:val="16"/>
-                <w:szCs w:val="16"/>
-              </w:rPr>
-              <w:t xml:space="preserve">0,172</w:t>
+              <w:cnfStyle w:val="000000100000" w:firstRow="0" w:lastRow="0" w:firstColumn="0" w:lastColumn="0" w:oddVBand="0" w:evenVBand="0" w:oddHBand="1" w:evenHBand="0" w:firstRowFirstColumn="0" w:firstRowLastColumn="0" w:lastRowFirstColumn="0" w:lastRowLastColumn="0"/>
+              <w:rPr>
+                <w:sz w:val="16"/>
+                <w:szCs w:val="16"/>
+              </w:rPr>
+            </w:pPr>
+            <w:r>
+              <w:rPr>
+                <w:sz w:val="16"/>
+                <w:szCs w:val="16"/>
+              </w:rPr>
+              <w:t>0,172</w:t>
             </w:r>
           </w:p>
         </w:tc>
@@ -12539,18 +12536,18 @@
           <w:p>
             <w:pPr>
               <w:jc w:val="right"/>
-              <w:cnfStyle w:val="000000100000" w:oddHBand="1"/>
-              <w:rPr>
-                <w:sz w:val="16"/>
-                <w:szCs w:val="16"/>
-              </w:rPr>
-            </w:pPr>
-            <w:r>
-              <w:rPr>
-                <w:sz w:val="16"/>
-                <w:szCs w:val="16"/>
-              </w:rPr>
-              <w:t xml:space="preserve">0,157</w:t>
+              <w:cnfStyle w:val="000000100000" w:firstRow="0" w:lastRow="0" w:firstColumn="0" w:lastColumn="0" w:oddVBand="0" w:evenVBand="0" w:oddHBand="1" w:evenHBand="0" w:firstRowFirstColumn="0" w:firstRowLastColumn="0" w:lastRowFirstColumn="0" w:lastRowLastColumn="0"/>
+              <w:rPr>
+                <w:sz w:val="16"/>
+                <w:szCs w:val="16"/>
+              </w:rPr>
+            </w:pPr>
+            <w:r>
+              <w:rPr>
+                <w:sz w:val="16"/>
+                <w:szCs w:val="16"/>
+              </w:rPr>
+              <w:t>0,157</w:t>
             </w:r>
           </w:p>
         </w:tc>
@@ -12561,18 +12558,18 @@
           <w:p>
             <w:pPr>
               <w:jc w:val="right"/>
-              <w:cnfStyle w:val="000000100000" w:oddHBand="1"/>
-              <w:rPr>
-                <w:sz w:val="16"/>
-                <w:szCs w:val="16"/>
-              </w:rPr>
-            </w:pPr>
-            <w:r>
-              <w:rPr>
-                <w:sz w:val="16"/>
-                <w:szCs w:val="16"/>
-              </w:rPr>
-              <w:t xml:space="preserve">0,279</w:t>
+              <w:cnfStyle w:val="000000100000" w:firstRow="0" w:lastRow="0" w:firstColumn="0" w:lastColumn="0" w:oddVBand="0" w:evenVBand="0" w:oddHBand="1" w:evenHBand="0" w:firstRowFirstColumn="0" w:firstRowLastColumn="0" w:lastRowFirstColumn="0" w:lastRowLastColumn="0"/>
+              <w:rPr>
+                <w:sz w:val="16"/>
+                <w:szCs w:val="16"/>
+              </w:rPr>
+            </w:pPr>
+            <w:r>
+              <w:rPr>
+                <w:sz w:val="16"/>
+                <w:szCs w:val="16"/>
+              </w:rPr>
+              <w:t>0,279</w:t>
             </w:r>
           </w:p>
         </w:tc>
@@ -12583,18 +12580,18 @@
           <w:p>
             <w:pPr>
               <w:jc w:val="right"/>
-              <w:cnfStyle w:val="000000100000" w:oddHBand="1"/>
-              <w:rPr>
-                <w:sz w:val="16"/>
-                <w:szCs w:val="16"/>
-              </w:rPr>
-            </w:pPr>
-            <w:r>
-              <w:rPr>
-                <w:sz w:val="16"/>
-                <w:szCs w:val="16"/>
-              </w:rPr>
-              <w:t xml:space="preserve">2,277</w:t>
+              <w:cnfStyle w:val="000000100000" w:firstRow="0" w:lastRow="0" w:firstColumn="0" w:lastColumn="0" w:oddVBand="0" w:evenVBand="0" w:oddHBand="1" w:evenHBand="0" w:firstRowFirstColumn="0" w:firstRowLastColumn="0" w:lastRowFirstColumn="0" w:lastRowLastColumn="0"/>
+              <w:rPr>
+                <w:sz w:val="16"/>
+                <w:szCs w:val="16"/>
+              </w:rPr>
+            </w:pPr>
+            <w:r>
+              <w:rPr>
+                <w:sz w:val="16"/>
+                <w:szCs w:val="16"/>
+              </w:rPr>
+              <w:t>2,277</w:t>
             </w:r>
           </w:p>
         </w:tc>
@@ -12605,18 +12602,18 @@
           <w:p>
             <w:pPr>
               <w:jc w:val="right"/>
-              <w:cnfStyle w:val="000000100000" w:oddHBand="1"/>
-              <w:rPr>
-                <w:sz w:val="16"/>
-                <w:szCs w:val="16"/>
-              </w:rPr>
-            </w:pPr>
-            <w:r>
-              <w:rPr>
-                <w:sz w:val="16"/>
-                <w:szCs w:val="16"/>
-              </w:rPr>
-              <w:t xml:space="preserve">2,526</w:t>
+              <w:cnfStyle w:val="000000100000" w:firstRow="0" w:lastRow="0" w:firstColumn="0" w:lastColumn="0" w:oddVBand="0" w:evenVBand="0" w:oddHBand="1" w:evenHBand="0" w:firstRowFirstColumn="0" w:firstRowLastColumn="0" w:lastRowFirstColumn="0" w:lastRowLastColumn="0"/>
+              <w:rPr>
+                <w:sz w:val="16"/>
+                <w:szCs w:val="16"/>
+              </w:rPr>
+            </w:pPr>
+            <w:r>
+              <w:rPr>
+                <w:sz w:val="16"/>
+                <w:szCs w:val="16"/>
+              </w:rPr>
+              <w:t>2,526</w:t>
             </w:r>
           </w:p>
         </w:tc>
@@ -12627,18 +12624,18 @@
           <w:p>
             <w:pPr>
               <w:jc w:val="right"/>
-              <w:cnfStyle w:val="000000100000" w:oddHBand="1"/>
-              <w:rPr>
-                <w:sz w:val="16"/>
-                <w:szCs w:val="16"/>
-              </w:rPr>
-            </w:pPr>
-            <w:r>
-              <w:rPr>
-                <w:sz w:val="16"/>
-                <w:szCs w:val="16"/>
-              </w:rPr>
-              <w:t xml:space="preserve">0,845</w:t>
+              <w:cnfStyle w:val="000000100000" w:firstRow="0" w:lastRow="0" w:firstColumn="0" w:lastColumn="0" w:oddVBand="0" w:evenVBand="0" w:oddHBand="1" w:evenHBand="0" w:firstRowFirstColumn="0" w:firstRowLastColumn="0" w:lastRowFirstColumn="0" w:lastRowLastColumn="0"/>
+              <w:rPr>
+                <w:sz w:val="16"/>
+                <w:szCs w:val="16"/>
+              </w:rPr>
+            </w:pPr>
+            <w:r>
+              <w:rPr>
+                <w:sz w:val="16"/>
+                <w:szCs w:val="16"/>
+              </w:rPr>
+              <w:t>0,845</w:t>
             </w:r>
           </w:p>
         </w:tc>
@@ -12647,67 +12644,75 @@
     <w:p/>
     <w:p>
       <w:r>
-        <w:t xml:space="preserve">Dekad ayrımı artık hatanın nerede kaldığını göstermektedir. 20.000 iterasyonda 10 kHz altındaki bütün bantlarda MAE 0,16 – 0,38 dB aralığına inerken 10 – 100 kHz bandında 2,28 dB, 100 – 467 kHz bandında 2,53 dB olarak kalmıştır. Cross-PSD kanalları 50 kHz kesim frekanslı LPF’den geçerken karşılaştırılan DUT periodogramı filtresizdir; bu nedenle yüksek offset bantlarındaki fark iterasyon ortalamasıyla azalmaz ve tam bant MAE’nin sıfıra yakınsamasını engelleyen bileşen ölçüm bandının dışında kalır. Ölçüm bandı içinde ise yakınsama açıkça sürmektedir: 1 – 10 kHz bandında MAE 1 iterasyonda 18,88 dB iken 20.000 iterasyonda 0,28 dB’ye inmiştir.</w:t>
-      </w:r>
-    </w:p>
-    <w:p>
-      <w:r>
-        <w:t xml:space="preserve">MAE ara noktalarda monoton azalmamıştır; her iterasyon değeri bağımsız rastgele realizasyonlarla çalıştırıldığından yerel artışlar Monte Carlo değişkenliğiyle uyumludur. Buna rağmen genel eğilim, iterasyon sayısı arttıkça Cross-PSD kestiriminin DUT periodogramına yaklaştığını göstermektedir.</w:t>
+        <w:t>Dekad ayrımı artık hatanın nerede kaldığını göstermektedir. 20.000 iterasyonda 10 kHz altındaki bütün bantlarda MAE 0,16 – 0,38 dB aralığına inerken 10 – 100 kHz bandında 2,28 dB, 100 – 467 kHz bandında 2,53 dB olarak kalmıştır. Cross-PSD kanalları 50 kHz kesim frekanslı LPF’den geçerken karşılaştırılan DUT periodogramı filtresizdir; bu nedenle yüksek offset bantlarındaki fark iterasyon ortalamasıyla azalmaz ve tam bant MAE’nin sıfıra yakınsamasını engelleyen bileşen ölçüm bandının dışında kalır. Ölçüm bandı içinde ise yakınsama açıkça sürmektedir: 1 – 10 kHz bandında MAE 1 iterasyonda 18,88 dB iken 20.000 iterasyonda 0,28 dB’ye inmiştir.</w:t>
+      </w:r>
+    </w:p>
+    <w:p>
+      <w:r>
+        <w:t xml:space="preserve">MAE ara noktalarda monoton azalmamıştır; her iterasyon değeri bağımsız rastgele realizasyonlarla çalıştırıldığından yerel artışlar Monte Carlo değişkenliğiyle uyumludur. Buna rağmen genel eğilim, iterasyon sayısı arttıkça Cross-PSD kestiriminin DUT </w:t>
       </w:r>
       <w:proofErr w:type="spellStart"/>
+      <w:r>
+        <w:t>periodogramına</w:t>
+      </w:r>
       <w:proofErr w:type="spellEnd"/>
+      <w:r>
+        <w:t xml:space="preserve"> yaklaştığını göstermektedir.</w:t>
+      </w:r>
+    </w:p>
+    <w:p>
+      <w:r>
+        <w:t>Dekad tablosu ayrıca yakınsama hızının offset bölgesine göre değiştiğini göstermektedir. 10 – 100 Hz bandı 250 iterasyonda 2,380 dB seviyesine inip 20.000 iterasyonda 0,172 dB’ye kadar düşerken, 10 – 100 kHz bandı aynı seviyeye ancak 2.000 iterasyon civarında (2,123 dB) inebilmiş ve 20.000 iterasyonda dahi 2,277 dB’de kalmıştır. Referans RMS değeri DUT’ye göre yüksek tutulduğu ve her test noktası bağımsız realizasyonlarla çalıştırıldığı için tek tek noktalar dalgalanmaktadır; buna rağmen eğilim açıktır: taşıyıcıya yakın offsetlerde birkaç yüz iterasyon yeterli olurken yüksek offsetlerde aynı doğruluğa ulaşmak çok daha yüksek iterasyon sayıları gerektirmektedir.</w:t>
+      </w:r>
+    </w:p>
+    <w:p/>
+    <w:p/>
+    <w:p/>
+    <w:p/>
+    <w:p/>
+    <w:p/>
+    <w:p/>
+    <w:p/>
+    <w:p>
+      <w:pPr>
+        <w:pStyle w:val="Heading1"/>
+        <w:rPr>
+          <w:b/>
+        </w:rPr>
+      </w:pPr>
+      <w:r>
+        <w:rPr>
+          <w:b/>
+        </w:rPr>
+        <w:lastRenderedPageBreak/>
+        <w:t>9. Sonuç</w:t>
+      </w:r>
+    </w:p>
+    <w:p>
+      <w:r>
+        <w:t xml:space="preserve">Bu projede iki referans kanallı faz </w:t>
+      </w:r>
       <w:proofErr w:type="spellStart"/>
+      <w:r>
+        <w:t>dedektörü</w:t>
+      </w:r>
       <w:proofErr w:type="spellEnd"/>
-    </w:p>
-    <w:p>
-      <w:r>
-        <w:t xml:space="preserve">Dekad tablosu ayrıca yakınsama hızının offset bölgesine göre değiştiğini göstermektedir. 10 – 100 Hz bandı 250 iterasyonda 2,380 dB seviyesine inip 20.000 iterasyonda 0,172 dB’ye kadar düşerken, 10 – 100 kHz bandı aynı seviyeye ancak 2.000 iterasyon civarında (2,123 dB) inebilmiş ve 20.000 iterasyonda dahi 2,277 dB’de kalmıştır. Referans RMS değeri DUT’ye göre yüksek tutulduğu ve her test noktası bağımsız realizasyonlarla çalıştırıldığı için tek tek noktalar dalgalanmaktadır; buna rağmen eğilim açıktır: taşıyıcıya yakın offsetlerde birkaç yüz iterasyon yeterli olurken yüksek offsetlerde aynı doğruluğa ulaşmak çok daha yüksek iterasyon sayıları gerektirmektedir.</w:t>
+      <w:r>
+        <w:t xml:space="preserve"> mimarisi GNU </w:t>
       </w:r>
       <w:proofErr w:type="spellStart"/>
+      <w:r>
+        <w:t>Octave</w:t>
+      </w:r>
       <w:proofErr w:type="spellEnd"/>
+      <w:r>
+        <w:t xml:space="preserve"> ortamında gerçekleştirilmiş, DUT faz gürültüsü Kompleks Cross-PSD ortalamasıyla kestirilmiş ve aynı Monte Carlı popülasyonunun filtresiz DUT </w:t>
+      </w:r>
       <w:proofErr w:type="spellStart"/>
+      <w:r>
+        <w:t>periodogramıyla</w:t>
+      </w:r>
       <w:proofErr w:type="spellEnd"/>
-    </w:p>
-    <w:p>
-      <w:pPr>
-        <w:pStyle w:val="Heading1"/>
-        <w:rPr>
-          <w:b/>
-        </w:rPr>
-      </w:pPr>
-      <w:r>
-        <w:rPr>
-          <w:b/>
-        </w:rPr>
-        <w:lastRenderedPageBreak/>
-        <w:t>9. Sonuç ve gelecek çalışmalar</w:t>
-      </w:r>
-    </w:p>
-    <w:p>
-      <w:r>
-        <w:t xml:space="preserve">Bu projede iki referans kanallı faz </w:t>
-      </w:r>
-      <w:proofErr w:type="spellStart"/>
-      <w:r>
-        <w:t>dedektörü</w:t>
-      </w:r>
-      <w:proofErr w:type="spellEnd"/>
-      <w:r>
-        <w:t xml:space="preserve"> mimarisi GNU </w:t>
-      </w:r>
-      <w:proofErr w:type="spellStart"/>
-      <w:r>
-        <w:t>Octave</w:t>
-      </w:r>
-      <w:proofErr w:type="spellEnd"/>
-      <w:r>
-        <w:t xml:space="preserve"> ortamında gerçekleştirilmiş, DUT faz gürültüsü Kompleks Cross-PSD ortalamasıyla kestirilmiş ve aynı Monte Carlı popülasyonunun filtresiz DUT </w:t>
-      </w:r>
-      <w:proofErr w:type="spellStart"/>
-      <w:r>
-        <w:t>periodogramıyla</w:t>
-      </w:r>
-      <w:proofErr w:type="spellEnd"/>
       <w:r>
         <w:t xml:space="preserve"> karşılaştırılmıştır. Fiziksel çapraz korelasyon ilkesi ile kodda kullanılan frekans bölgesi Cross-PSD kestiricisi ayrı biçimde tanımlanmıştır.</w:t>
       </w:r>
@@ -12719,7 +12724,13 @@
     </w:p>
     <w:p>
       <w:r>
-        <w:t>Çıkarılabilecek en önemli sonuç referans RMS değerinin olabildiğince düşük olmasının gerektiği, düşük olmasa dahi</w:t>
+        <w:t xml:space="preserve">Çıkarılabilecek en önemli sonuç referans RMS değerinin düşük olmasının </w:t>
+      </w:r>
+      <w:r>
+        <w:t>ölçüm doğruluğu açısından yararlı olması</w:t>
+      </w:r>
+      <w:r>
+        <w:t>, düşük olmasa dahi</w:t>
       </w:r>
       <w:r>
         <w:t xml:space="preserve"> </w:t>
@@ -12799,8 +12810,6 @@
           </wp:inline>
         </w:drawing>
       </w:r>
-      <w:bookmarkStart w:id="1" w:name="_GoBack"/>
-      <w:bookmarkEnd w:id="1"/>
     </w:p>
     <w:p>
       <w:pPr>
@@ -14798,7 +14807,7 @@
 </file>
 
 <file path=customXml/itemProps1.xml><?xml version="1.0" encoding="utf-8"?>
-<ds:datastoreItem xmlns:ds="http://schemas.openxmlformats.org/officeDocument/2006/customXml" ds:itemID="{D2BFA93D-3B8B-4E26-B674-16EAC82F57A7}">
+<ds:datastoreItem xmlns:ds="http://schemas.openxmlformats.org/officeDocument/2006/customXml" ds:itemID="{4A360BF9-4F57-48F4-9F1F-D3123C60B5CC}">
   <ds:schemaRefs>
     <ds:schemaRef ds:uri="http://schemas.openxmlformats.org/officeDocument/2006/bibliography"/>
   </ds:schemaRefs>

</xml_diff>

<commit_message>
Archive legacy sources and add Octave presentation plots
</commit_message>
<xml_diff>
--- a/yeni_50kHz.docx
+++ b/yeni_50kHz.docx
@@ -93,14 +93,12 @@
         </w:rPr>
         <w:t xml:space="preserve">Çalışmanın amacı iki referans kanallı faz </w:t>
       </w:r>
-      <w:proofErr w:type="spellStart"/>
       <w:r>
         <w:rPr>
           <w:rFonts w:cs="Arial"/>
         </w:rPr>
-        <w:t>dedektörü</w:t>
-      </w:r>
-      <w:proofErr w:type="spellEnd"/>
+        <w:t>detektörü</w:t>
+      </w:r>
       <w:r>
         <w:rPr>
           <w:rFonts w:cs="Arial"/>
@@ -135,21 +133,7 @@
         <w:rPr>
           <w:rFonts w:cs="Arial"/>
         </w:rPr>
-        <w:t xml:space="preserve">İdeal bir osilatör frekans bölgesinde tek bir spektral çizgi üretir. Gerçek devrelerde termal etkiler, aktif eleman gürültüsü, </w:t>
-      </w:r>
-      <w:proofErr w:type="spellStart"/>
-      <w:r>
-        <w:rPr>
-          <w:rFonts w:cs="Arial"/>
-        </w:rPr>
-        <w:t>rezonatör</w:t>
-      </w:r>
-      <w:proofErr w:type="spellEnd"/>
-      <w:r>
-        <w:rPr>
-          <w:rFonts w:cs="Arial"/>
-        </w:rPr>
-        <w:t xml:space="preserve"> kayıpları, besleme değişimleri ve çevresel koşullar sinyalin anlık fazında rastgele sapmalara yol açar. Taşıyıcı çevresinde oluşan bu yan bantlar faz gürültüsü olarak adlandırılır.</w:t>
+        <w:t>İdeal bir osilatör frekans bölgesinde tek bir spektral çizgi üretir. Gerçek devrelerde termal etkiler, aktif eleman gürültüsü, rezonatör kayıpları, besleme değişimleri ve çevresel koşullar sinyalin anlık fazında rastgele sapmalara yol açar. Taşıyıcı çevresinde oluşan bu yan bantlar faz gürültüsü olarak adlandırılır.</w:t>
       </w:r>
     </w:p>
     <w:p>
@@ -562,15 +546,7 @@
     <w:p/>
     <w:p>
       <w:r>
-        <w:t xml:space="preserve">Bu projede yalnızca faz gürültüsü ele alındığı için </w:t>
-      </w:r>
-      <w:proofErr w:type="spellStart"/>
-      <w:r>
-        <w:t>için</w:t>
-      </w:r>
-      <w:proofErr w:type="spellEnd"/>
-      <w:r>
-        <w:t xml:space="preserve"> modeli:</w:t>
+        <w:t>Bu projede yalnızca faz gürültüsü ele alındığı için modeli:</w:t>
       </w:r>
     </w:p>
     <w:p>
@@ -798,15 +774,7 @@
     </w:p>
     <w:p>
       <w:r>
-        <w:t xml:space="preserve">Faz gürültüsü çoğunlukla taşıyıcıdan belirli bir offset frekansındaki 1 Hz bant genişliğine </w:t>
-      </w:r>
-      <w:proofErr w:type="spellStart"/>
-      <w:r>
-        <w:t>normalize</w:t>
-      </w:r>
-      <w:proofErr w:type="spellEnd"/>
-      <w:r>
-        <w:t xml:space="preserve"> edilmiş tek yan bant güç oranı olarak verilir.</w:t>
+        <w:t>Faz gürültüsü çoğunlukla taşıyıcıdan belirli bir offset frekansındaki 1 Hz bant genişliğine normalize edilmiş tek yan bant güç oranı olarak verilir.</w:t>
       </w:r>
     </w:p>
     <w:p>
@@ -2480,21 +2448,17 @@
               <w:cnfStyle w:val="000000100000" w:firstRow="0" w:lastRow="0" w:firstColumn="0" w:lastColumn="0" w:oddVBand="0" w:evenVBand="0" w:oddHBand="1" w:evenHBand="0" w:firstRowFirstColumn="0" w:firstRowLastColumn="0" w:lastRowFirstColumn="0" w:lastRowLastColumn="0"/>
             </w:pPr>
             <w:r>
-              <w:t xml:space="preserve">−40 </w:t>
-            </w:r>
-            <w:proofErr w:type="spellStart"/>
-            <w:r>
-              <w:t>db</w:t>
-            </w:r>
-            <w:proofErr w:type="spellEnd"/>
+              <w:t>−40 d</w:t>
+            </w:r>
+            <w:r>
+              <w:t>B</w:t>
+            </w:r>
             <w:r>
               <w:t>/</w:t>
             </w:r>
-            <w:proofErr w:type="spellStart"/>
             <w:r>
               <w:t>dekad</w:t>
             </w:r>
-            <w:proofErr w:type="spellEnd"/>
           </w:p>
         </w:tc>
         <w:tc>
@@ -2598,24 +2562,17 @@
               <w:cnfStyle w:val="000000000000" w:firstRow="0" w:lastRow="0" w:firstColumn="0" w:lastColumn="0" w:oddVBand="0" w:evenVBand="0" w:oddHBand="0" w:evenHBand="0" w:firstRowFirstColumn="0" w:firstRowLastColumn="0" w:lastRowFirstColumn="0" w:lastRowLastColumn="0"/>
             </w:pPr>
             <w:r>
-              <w:t xml:space="preserve">−30 </w:t>
-            </w:r>
-            <w:proofErr w:type="spellStart"/>
-            <w:r>
-              <w:t>db</w:t>
-            </w:r>
-            <w:proofErr w:type="spellEnd"/>
-            <w:r>
-              <w:t>/</w:t>
-            </w:r>
-            <w:proofErr w:type="spellStart"/>
-            <w:r>
-              <w:t>de</w:t>
+              <w:t>−30 d</w:t>
+            </w:r>
+            <w:r>
+              <w:t>B</w:t>
+            </w:r>
+            <w:r>
+              <w:t>/de</w:t>
             </w:r>
             <w:r>
               <w:t>kad</w:t>
             </w:r>
-            <w:proofErr w:type="spellEnd"/>
           </w:p>
         </w:tc>
         <w:tc>
@@ -2714,24 +2671,17 @@
               <w:cnfStyle w:val="000000100000" w:firstRow="0" w:lastRow="0" w:firstColumn="0" w:lastColumn="0" w:oddVBand="0" w:evenVBand="0" w:oddHBand="1" w:evenHBand="0" w:firstRowFirstColumn="0" w:firstRowLastColumn="0" w:lastRowFirstColumn="0" w:lastRowLastColumn="0"/>
             </w:pPr>
             <w:r>
-              <w:t xml:space="preserve">−20 </w:t>
-            </w:r>
-            <w:proofErr w:type="spellStart"/>
-            <w:r>
-              <w:t>db</w:t>
-            </w:r>
-            <w:proofErr w:type="spellEnd"/>
-            <w:r>
-              <w:t>/</w:t>
-            </w:r>
-            <w:proofErr w:type="spellStart"/>
-            <w:r>
-              <w:t>de</w:t>
+              <w:t>−20 d</w:t>
+            </w:r>
+            <w:r>
+              <w:t>B</w:t>
+            </w:r>
+            <w:r>
+              <w:t>/de</w:t>
             </w:r>
             <w:r>
               <w:t>kad</w:t>
             </w:r>
-            <w:proofErr w:type="spellEnd"/>
           </w:p>
         </w:tc>
         <w:tc>
@@ -2809,24 +2759,17 @@
               <w:cnfStyle w:val="000000000000" w:firstRow="0" w:lastRow="0" w:firstColumn="0" w:lastColumn="0" w:oddVBand="0" w:evenVBand="0" w:oddHBand="0" w:evenHBand="0" w:firstRowFirstColumn="0" w:firstRowLastColumn="0" w:lastRowFirstColumn="0" w:lastRowLastColumn="0"/>
             </w:pPr>
             <w:r>
-              <w:t xml:space="preserve">−10 </w:t>
-            </w:r>
-            <w:proofErr w:type="spellStart"/>
-            <w:r>
-              <w:t>db</w:t>
-            </w:r>
-            <w:proofErr w:type="spellEnd"/>
-            <w:r>
-              <w:t>/</w:t>
-            </w:r>
-            <w:proofErr w:type="spellStart"/>
-            <w:r>
-              <w:t>de</w:t>
+              <w:t>−10 d</w:t>
+            </w:r>
+            <w:r>
+              <w:t>B</w:t>
+            </w:r>
+            <w:r>
+              <w:t>/de</w:t>
             </w:r>
             <w:r>
               <w:t>kad</w:t>
             </w:r>
-            <w:proofErr w:type="spellEnd"/>
           </w:p>
         </w:tc>
         <w:tc>
@@ -2893,24 +2836,17 @@
               <w:cnfStyle w:val="000000100000" w:firstRow="0" w:lastRow="0" w:firstColumn="0" w:lastColumn="0" w:oddVBand="0" w:evenVBand="0" w:oddHBand="1" w:evenHBand="0" w:firstRowFirstColumn="0" w:firstRowLastColumn="0" w:lastRowFirstColumn="0" w:lastRowLastColumn="0"/>
             </w:pPr>
             <w:r>
-              <w:t xml:space="preserve">0 </w:t>
-            </w:r>
-            <w:proofErr w:type="spellStart"/>
-            <w:r>
-              <w:t>db</w:t>
-            </w:r>
-            <w:proofErr w:type="spellEnd"/>
-            <w:r>
-              <w:t>/</w:t>
-            </w:r>
-            <w:proofErr w:type="spellStart"/>
-            <w:r>
-              <w:t>de</w:t>
+              <w:t>0 d</w:t>
+            </w:r>
+            <w:r>
+              <w:t>B</w:t>
+            </w:r>
+            <w:r>
+              <w:t>/de</w:t>
             </w:r>
             <w:r>
               <w:t>kad</w:t>
             </w:r>
-            <w:proofErr w:type="spellEnd"/>
           </w:p>
         </w:tc>
         <w:tc>
@@ -4673,23 +4609,7 @@
           <w:i/>
           <w:sz w:val="18"/>
         </w:rPr>
-        <w:t>Cross-</w:t>
-      </w:r>
-      <w:proofErr w:type="spellStart"/>
-      <w:r>
-        <w:rPr>
-          <w:i/>
-          <w:sz w:val="18"/>
-        </w:rPr>
-        <w:t>Correlation</w:t>
-      </w:r>
-      <w:proofErr w:type="spellEnd"/>
-      <w:r>
-        <w:rPr>
-          <w:i/>
-          <w:sz w:val="18"/>
-        </w:rPr>
-        <w:t xml:space="preserve"> ile Faz Detektörü </w:t>
+        <w:t xml:space="preserve">Cross-Correlation ile Faz Detektörü </w:t>
       </w:r>
       <w:r>
         <w:rPr>
@@ -4963,16 +4883,10 @@
         <w:rPr>
           <w:rFonts w:eastAsiaTheme="minorEastAsia"/>
         </w:rPr>
-        <w:t xml:space="preserve">Sonrasında her sinyal için gürültü üretimi birbirinden bağımsız ve farklı çağrılarda yapılır, yapılan gürültü oluşturma çağrısında her seferinde zaman damgasının büyük bir asal sayıyla çarpımının 10000 ile modülasyonu </w:t>
-      </w:r>
-      <w:proofErr w:type="spellStart"/>
-      <w:r>
-        <w:rPr>
-          <w:rFonts w:eastAsiaTheme="minorEastAsia"/>
-        </w:rPr>
-        <w:t>seed</w:t>
-      </w:r>
-      <w:proofErr w:type="spellEnd"/>
+        <w:t>Sonrasında her sinyal için gürültü üretimi birbirinden bağımsız ve farklı çağrılarda yapılır, yapılan gürültü oluşturma çağrısında her seferinde zaman damgasının büyük bir asal sayıyla çarpımının 10000 ile modülasyonu seed</w:t>
+      </w:r>
+      <w:bookmarkStart w:id="1" w:name="_GoBack"/>
+      <w:bookmarkEnd w:id="1"/>
       <w:r>
         <w:rPr>
           <w:rFonts w:eastAsiaTheme="minorEastAsia"/>
@@ -9732,8 +9646,6 @@
       <w:r>
         <w:t>D</w:t>
       </w:r>
-      <w:bookmarkStart w:id="1" w:name="_GoBack"/>
-      <w:bookmarkEnd w:id="1"/>
     </w:p>
     <w:p>
       <w:pPr>
@@ -14807,7 +14719,7 @@
 </file>
 
 <file path=customXml/itemProps1.xml><?xml version="1.0" encoding="utf-8"?>
-<ds:datastoreItem xmlns:ds="http://schemas.openxmlformats.org/officeDocument/2006/customXml" ds:itemID="{4A360BF9-4F57-48F4-9F1F-D3123C60B5CC}">
+<ds:datastoreItem xmlns:ds="http://schemas.openxmlformats.org/officeDocument/2006/customXml" ds:itemID="{B370CFBA-D027-402D-AF10-B86AFB63C622}">
   <ds:schemaRefs>
     <ds:schemaRef ds:uri="http://schemas.openxmlformats.org/officeDocument/2006/bibliography"/>
   </ds:schemaRefs>

</xml_diff>

<commit_message>
Update 50 kHz report document
</commit_message>
<xml_diff>
--- a/yeni_50kHz.docx
+++ b/yeni_50kHz.docx
@@ -4619,53 +4619,1274 @@
         <w:t>Blok Diyagramı</w:t>
       </w:r>
     </w:p>
+    <w:p>
+      <w:pPr>
+        <w:rPr>
+          <w:b/>
+        </w:rPr>
+      </w:pPr>
+    </w:p>
+    <w:p>
+      <w:pPr>
+        <w:pStyle w:val="Heading2"/>
+      </w:pPr>
+      <w:r>
+        <w:t>5</w:t>
+      </w:r>
+      <w:r>
+        <w:t xml:space="preserve">.4. Diğer </w:t>
+      </w:r>
+      <w:r>
+        <w:t>y</w:t>
+      </w:r>
+      <w:r>
+        <w:t>öntemler</w:t>
+      </w:r>
+    </w:p>
+    <w:p>
+      <w:r>
+        <w:rPr>
+          <w:b/>
+        </w:rPr>
+        <w:t>Gecikme hattı ayırıcısı</w:t>
+      </w:r>
+      <w:r>
+        <w:t xml:space="preserve"> yönteminde DUT sinyali iki kola ayrılarak kollardan biri geciktirilir ve frekans değişimleri faz değişimine dönüştürülür.</w:t>
+      </w:r>
+    </w:p>
+    <w:p>
+      <w:r>
+        <w:rPr>
+          <w:b/>
+        </w:rPr>
+        <w:t>Dijital faz demodülasyonunda</w:t>
+      </w:r>
+      <w:r>
+        <w:t xml:space="preserve"> ise işaret sayısallaştırılarak I/Q bileşenlerinden anlık faz hesaplanır.</w:t>
+      </w:r>
+    </w:p>
+    <w:p>
+      <w:r>
+        <w:t xml:space="preserve">Bu yöntemler farklı uygulamalarda avantajlı olsa da bu çalışmanın odağını faz detektörü tabanlı </w:t>
+      </w:r>
+      <w:proofErr w:type="spellStart"/>
+      <w:r>
+        <w:t>cross-correlation</w:t>
+      </w:r>
+      <w:proofErr w:type="spellEnd"/>
+      <w:r>
+        <w:t xml:space="preserve"> yöntemi oluşturmaktadır.</w:t>
+      </w:r>
+    </w:p>
     <w:p/>
     <w:p>
       <w:pPr>
         <w:pStyle w:val="Heading2"/>
       </w:pPr>
       <w:r>
+        <w:t xml:space="preserve">5.4. </w:t>
+      </w:r>
+      <w:r>
+        <w:t>Neden 90° (Quadrature Çalışma Noktası)?</w:t>
+      </w:r>
+    </w:p>
+    <w:p>
+      <w:r>
+        <w:t xml:space="preserve">Ölçüm sisteminde mikser faz </w:t>
+      </w:r>
+      <w:proofErr w:type="spellStart"/>
+      <w:r>
+        <w:t>dedektörü</w:t>
+      </w:r>
+      <w:proofErr w:type="spellEnd"/>
+      <w:r>
+        <w:t xml:space="preserve"> olarak çalışır. </w:t>
+      </w:r>
+    </w:p>
+    <w:p>
+      <m:oMath>
+        <m:sSub>
+          <m:sSubPr>
+            <m:ctrlPr>
+              <w:rPr>
+                <w:rFonts w:ascii="Cambria Math" w:hAnsi="Cambria Math"/>
+                <w:i/>
+              </w:rPr>
+            </m:ctrlPr>
+          </m:sSubPr>
+          <m:e>
+            <m:r>
+              <w:rPr>
+                <w:rFonts w:ascii="Cambria Math" w:hAnsi="Cambria Math"/>
+              </w:rPr>
+              <m:t>x</m:t>
+            </m:r>
+          </m:e>
+          <m:sub>
+            <m:r>
+              <w:rPr>
+                <w:rFonts w:ascii="Cambria Math" w:hAnsi="Cambria Math"/>
+              </w:rPr>
+              <m:t>DUT</m:t>
+            </m:r>
+          </m:sub>
+        </m:sSub>
+        <m:r>
+          <w:rPr>
+            <w:rFonts w:ascii="Cambria Math" w:hAnsi="Cambria Math"/>
+          </w:rPr>
+          <m:t>(t) = Acos(ω</m:t>
+        </m:r>
+        <m:r>
+          <w:rPr>
+            <w:rFonts w:ascii="Cambria Math" w:hAnsi="Cambria Math" w:cs="Cambria Math"/>
+          </w:rPr>
+          <m:t>₀</m:t>
+        </m:r>
+        <m:r>
+          <w:rPr>
+            <w:rFonts w:ascii="Cambria Math" w:hAnsi="Cambria Math"/>
+          </w:rPr>
+          <m:t xml:space="preserve">t + </m:t>
+        </m:r>
+        <m:sSub>
+          <m:sSubPr>
+            <m:ctrlPr>
+              <w:rPr>
+                <w:rFonts w:ascii="Cambria Math" w:hAnsi="Cambria Math" w:cs="Arial"/>
+                <w:i/>
+              </w:rPr>
+            </m:ctrlPr>
+          </m:sSubPr>
+          <m:e>
+            <m:r>
+              <w:rPr>
+                <w:rFonts w:ascii="Cambria Math" w:hAnsi="Cambria Math" w:cs="Arial"/>
+              </w:rPr>
+              <m:t>φ</m:t>
+            </m:r>
+          </m:e>
+          <m:sub>
+            <m:r>
+              <w:rPr>
+                <w:rFonts w:ascii="Cambria Math" w:hAnsi="Cambria Math" w:cs="Arial"/>
+              </w:rPr>
+              <m:t>DUT</m:t>
+            </m:r>
+          </m:sub>
+        </m:sSub>
+        <m:r>
+          <w:rPr>
+            <w:rFonts w:ascii="Cambria Math" w:hAnsi="Cambria Math"/>
+          </w:rPr>
+          <m:t>(t))</m:t>
+        </m:r>
+      </m:oMath>
+      <w:r>
+        <w:t xml:space="preserve"> </w:t>
+      </w:r>
+      <w:proofErr w:type="gramStart"/>
+      <w:r>
+        <w:t>ile</w:t>
+      </w:r>
+      <w:proofErr w:type="gramEnd"/>
+      <w:r>
+        <w:t xml:space="preserve"> referans sinyali </w:t>
+      </w:r>
+      <m:oMath>
+        <m:sSub>
+          <m:sSubPr>
+            <m:ctrlPr>
+              <w:rPr>
+                <w:rFonts w:ascii="Cambria Math" w:hAnsi="Cambria Math"/>
+                <w:i/>
+              </w:rPr>
+            </m:ctrlPr>
+          </m:sSubPr>
+          <m:e>
+            <m:r>
+              <w:rPr>
+                <w:rFonts w:ascii="Cambria Math" w:hAnsi="Cambria Math"/>
+              </w:rPr>
+              <m:t>x</m:t>
+            </m:r>
+          </m:e>
+          <m:sub>
+            <m:r>
+              <w:rPr>
+                <w:rFonts w:ascii="Cambria Math" w:hAnsi="Cambria Math"/>
+              </w:rPr>
+              <m:t>REF</m:t>
+            </m:r>
+          </m:sub>
+        </m:sSub>
+        <m:r>
+          <w:rPr>
+            <w:rFonts w:ascii="Cambria Math" w:hAnsi="Cambria Math"/>
+          </w:rPr>
+          <m:t>(t) = Acos(</m:t>
+        </m:r>
+        <m:sSup>
+          <m:sSupPr>
+            <m:ctrlPr>
+              <w:rPr>
+                <w:rFonts w:ascii="Cambria Math" w:hAnsi="Cambria Math" w:cs="Cambria Math"/>
+                <w:i/>
+              </w:rPr>
+            </m:ctrlPr>
+          </m:sSupPr>
+          <m:e>
+            <m:r>
+              <w:rPr>
+                <w:rFonts w:ascii="Cambria Math" w:hAnsi="Cambria Math"/>
+              </w:rPr>
+              <m:t>ω</m:t>
+            </m:r>
+            <m:ctrlPr>
+              <w:rPr>
+                <w:rFonts w:ascii="Cambria Math" w:hAnsi="Cambria Math"/>
+                <w:i/>
+              </w:rPr>
+            </m:ctrlPr>
+          </m:e>
+          <m:sup>
+            <m:r>
+              <w:rPr>
+                <w:rFonts w:ascii="Cambria Math" w:hAnsi="Cambria Math" w:cs="Cambria Math"/>
+              </w:rPr>
+              <m:t>0</m:t>
+            </m:r>
+          </m:sup>
+        </m:sSup>
+        <m:r>
+          <w:rPr>
+            <w:rFonts w:ascii="Cambria Math" w:hAnsi="Cambria Math"/>
+          </w:rPr>
+          <m:t xml:space="preserve">t + </m:t>
+        </m:r>
+        <m:sSub>
+          <m:sSubPr>
+            <m:ctrlPr>
+              <w:rPr>
+                <w:rFonts w:ascii="Cambria Math" w:hAnsi="Cambria Math" w:cs="Arial"/>
+                <w:i/>
+              </w:rPr>
+            </m:ctrlPr>
+          </m:sSubPr>
+          <m:e>
+            <m:r>
+              <w:rPr>
+                <w:rFonts w:ascii="Cambria Math" w:hAnsi="Cambria Math" w:cs="Arial"/>
+              </w:rPr>
+              <m:t>φ</m:t>
+            </m:r>
+          </m:e>
+          <m:sub>
+            <m:r>
+              <w:rPr>
+                <w:rFonts w:ascii="Cambria Math" w:hAnsi="Cambria Math" w:cs="Arial"/>
+              </w:rPr>
+              <m:t>REF</m:t>
+            </m:r>
+          </m:sub>
+        </m:sSub>
+        <m:d>
+          <m:dPr>
+            <m:ctrlPr>
+              <w:rPr>
+                <w:rFonts w:ascii="Cambria Math" w:hAnsi="Cambria Math"/>
+                <w:i/>
+              </w:rPr>
+            </m:ctrlPr>
+          </m:dPr>
+          <m:e>
+            <m:r>
+              <w:rPr>
+                <w:rFonts w:ascii="Cambria Math" w:hAnsi="Cambria Math"/>
+              </w:rPr>
+              <m:t>t</m:t>
+            </m:r>
+          </m:e>
+        </m:d>
+        <m:r>
+          <w:rPr>
+            <w:rFonts w:ascii="Cambria Math" w:hAnsi="Cambria Math"/>
+          </w:rPr>
+          <m:t>+</m:t>
+        </m:r>
+        <m:r>
+          <w:rPr>
+            <w:rFonts w:ascii="Cambria Math" w:hAnsi="Cambria Math"/>
+          </w:rPr>
+          <m:t>θ)</m:t>
+        </m:r>
+      </m:oMath>
+      <w:r>
+        <w:t xml:space="preserve"> </w:t>
+      </w:r>
+      <w:r>
+        <w:rPr>
+          <w:rFonts w:cs="Arial"/>
+        </w:rPr>
+        <w:t>ç</w:t>
+      </w:r>
+      <w:r>
+        <w:t>arp</w:t>
+      </w:r>
+      <w:r>
+        <w:rPr>
+          <w:rFonts w:cs="Arial"/>
+        </w:rPr>
+        <w:t>ı</w:t>
+      </w:r>
+      <w:r>
+        <w:t>l</w:t>
+      </w:r>
+      <w:r>
+        <w:rPr>
+          <w:rFonts w:cs="Arial"/>
+        </w:rPr>
+        <w:t>ı</w:t>
+      </w:r>
+      <w:r>
+        <w:t>r ve al</w:t>
+      </w:r>
+      <w:r>
+        <w:rPr>
+          <w:rFonts w:cs="Arial"/>
+        </w:rPr>
+        <w:t>ç</w:t>
+      </w:r>
+      <w:r>
+        <w:t>ak ge</w:t>
+      </w:r>
+      <w:r>
+        <w:rPr>
+          <w:rFonts w:cs="Arial"/>
+        </w:rPr>
+        <w:t>ç</w:t>
+      </w:r>
+      <w:r>
+        <w:t>iren filtre (LPF) toplam frekans bile</w:t>
+      </w:r>
+      <w:r>
+        <w:rPr>
+          <w:rFonts w:cs="Arial"/>
+        </w:rPr>
+        <w:t>ş</w:t>
+      </w:r>
+      <w:r>
+        <w:t>enini bast</w:t>
+      </w:r>
+      <w:r>
+        <w:rPr>
+          <w:rFonts w:cs="Arial"/>
+        </w:rPr>
+        <w:t>ı</w:t>
+      </w:r>
+      <w:r>
+        <w:t>r</w:t>
+      </w:r>
+      <w:r>
+        <w:rPr>
+          <w:rFonts w:cs="Arial"/>
+        </w:rPr>
+        <w:t>ı</w:t>
+      </w:r>
+      <w:r>
+        <w:t xml:space="preserve">r. Filtre </w:t>
+      </w:r>
+      <w:r>
+        <w:rPr>
+          <w:rFonts w:cs="Arial"/>
+        </w:rPr>
+        <w:t>çı</w:t>
+      </w:r>
+      <w:r>
+        <w:t>k</w:t>
+      </w:r>
+      <w:r>
+        <w:rPr>
+          <w:rFonts w:cs="Arial"/>
+        </w:rPr>
+        <w:t>ışı</w:t>
+      </w:r>
+      <w:r>
+        <w:t>nda kalan taban bant gerilimi</w:t>
+      </w:r>
+    </w:p>
+    <w:p>
+      <w:pPr>
+        <w:rPr>
+          <w:sz w:val="24"/>
+        </w:rPr>
+      </w:pPr>
+      <m:oMathPara>
+        <m:oMath>
+          <m:r>
+            <w:rPr>
+              <w:rFonts w:ascii="Cambria Math" w:hAnsi="Cambria Math"/>
+              <w:sz w:val="24"/>
+            </w:rPr>
+            <w:lastRenderedPageBreak/>
+            <m:t>V(t) =</m:t>
+          </m:r>
+          <m:f>
+            <m:fPr>
+              <m:ctrlPr>
+                <w:rPr>
+                  <w:rFonts w:ascii="Cambria Math" w:hAnsi="Cambria Math"/>
+                  <w:i/>
+                  <w:sz w:val="24"/>
+                </w:rPr>
+              </m:ctrlPr>
+            </m:fPr>
+            <m:num>
+              <m:sSup>
+                <m:sSupPr>
+                  <m:ctrlPr>
+                    <w:rPr>
+                      <w:rFonts w:ascii="Cambria Math" w:hAnsi="Cambria Math"/>
+                      <w:i/>
+                      <w:sz w:val="24"/>
+                    </w:rPr>
+                  </m:ctrlPr>
+                </m:sSupPr>
+                <m:e>
+                  <m:r>
+                    <w:rPr>
+                      <w:rFonts w:ascii="Cambria Math" w:hAnsi="Cambria Math"/>
+                      <w:sz w:val="24"/>
+                    </w:rPr>
+                    <m:t>A</m:t>
+                  </m:r>
+                </m:e>
+                <m:sup>
+                  <m:r>
+                    <w:rPr>
+                      <w:rFonts w:ascii="Cambria Math" w:hAnsi="Cambria Math"/>
+                      <w:sz w:val="24"/>
+                    </w:rPr>
+                    <m:t>2</m:t>
+                  </m:r>
+                </m:sup>
+              </m:sSup>
+            </m:num>
+            <m:den>
+              <m:r>
+                <w:rPr>
+                  <w:rFonts w:ascii="Cambria Math" w:hAnsi="Cambria Math"/>
+                  <w:sz w:val="24"/>
+                </w:rPr>
+                <m:t>2</m:t>
+              </m:r>
+            </m:den>
+          </m:f>
+          <m:r>
+            <w:rPr>
+              <w:rFonts w:ascii="Cambria Math" w:hAnsi="Cambria Math"/>
+              <w:sz w:val="24"/>
+            </w:rPr>
+            <m:t>cos(</m:t>
+          </m:r>
+          <m:sSub>
+            <m:sSubPr>
+              <m:ctrlPr>
+                <w:rPr>
+                  <w:rFonts w:ascii="Cambria Math" w:hAnsi="Cambria Math" w:cs="Arial"/>
+                  <w:i/>
+                  <w:sz w:val="24"/>
+                </w:rPr>
+              </m:ctrlPr>
+            </m:sSubPr>
+            <m:e>
+              <m:r>
+                <w:rPr>
+                  <w:rFonts w:ascii="Cambria Math" w:hAnsi="Cambria Math" w:cs="Arial"/>
+                  <w:sz w:val="24"/>
+                </w:rPr>
+                <m:t>φ</m:t>
+              </m:r>
+            </m:e>
+            <m:sub>
+              <m:r>
+                <w:rPr>
+                  <w:rFonts w:ascii="Cambria Math" w:hAnsi="Cambria Math" w:cs="Arial"/>
+                  <w:sz w:val="24"/>
+                </w:rPr>
+                <m:t>DUT</m:t>
+              </m:r>
+            </m:sub>
+          </m:sSub>
+          <m:d>
+            <m:dPr>
+              <m:ctrlPr>
+                <w:rPr>
+                  <w:rFonts w:ascii="Cambria Math" w:hAnsi="Cambria Math"/>
+                  <w:i/>
+                  <w:sz w:val="24"/>
+                </w:rPr>
+              </m:ctrlPr>
+            </m:dPr>
+            <m:e>
+              <m:r>
+                <w:rPr>
+                  <w:rFonts w:ascii="Cambria Math" w:hAnsi="Cambria Math"/>
+                  <w:sz w:val="24"/>
+                </w:rPr>
+                <m:t>t</m:t>
+              </m:r>
+            </m:e>
+          </m:d>
+          <m:r>
+            <w:rPr>
+              <w:rFonts w:ascii="Cambria Math" w:hAnsi="Cambria Math"/>
+              <w:sz w:val="24"/>
+            </w:rPr>
+            <m:t>-</m:t>
+          </m:r>
+          <m:sSub>
+            <m:sSubPr>
+              <m:ctrlPr>
+                <w:rPr>
+                  <w:rFonts w:ascii="Cambria Math" w:hAnsi="Cambria Math" w:cs="Arial"/>
+                  <w:i/>
+                  <w:sz w:val="24"/>
+                </w:rPr>
+              </m:ctrlPr>
+            </m:sSubPr>
+            <m:e>
+              <m:r>
+                <w:rPr>
+                  <w:rFonts w:ascii="Cambria Math" w:hAnsi="Cambria Math" w:cs="Arial"/>
+                  <w:sz w:val="24"/>
+                </w:rPr>
+                <m:t>φ</m:t>
+              </m:r>
+            </m:e>
+            <m:sub>
+              <m:r>
+                <w:rPr>
+                  <w:rFonts w:ascii="Cambria Math" w:hAnsi="Cambria Math" w:cs="Arial"/>
+                  <w:sz w:val="24"/>
+                </w:rPr>
+                <m:t>REF</m:t>
+              </m:r>
+            </m:sub>
+          </m:sSub>
+          <m:d>
+            <m:dPr>
+              <m:ctrlPr>
+                <w:rPr>
+                  <w:rFonts w:ascii="Cambria Math" w:hAnsi="Cambria Math"/>
+                  <w:i/>
+                  <w:sz w:val="24"/>
+                </w:rPr>
+              </m:ctrlPr>
+            </m:dPr>
+            <m:e>
+              <m:r>
+                <w:rPr>
+                  <w:rFonts w:ascii="Cambria Math" w:hAnsi="Cambria Math"/>
+                  <w:sz w:val="24"/>
+                </w:rPr>
+                <m:t>t</m:t>
+              </m:r>
+            </m:e>
+          </m:d>
+          <m:r>
+            <w:rPr>
+              <w:rFonts w:ascii="Cambria Math" w:hAnsi="Cambria Math"/>
+              <w:sz w:val="24"/>
+            </w:rPr>
+            <m:t>-θ)</m:t>
+          </m:r>
+        </m:oMath>
+      </m:oMathPara>
+    </w:p>
+    <w:p>
+      <w:proofErr w:type="gramStart"/>
+      <w:r>
+        <w:t>olur</w:t>
+      </w:r>
+      <w:proofErr w:type="gramEnd"/>
+      <w:r>
+        <w:t>; burada θ, DUT ile referans arasındaki merkez faz farkıdır. Detektörün küçük işaret hassasiyeti bu karakteristiğin faz farkına türeviyle belirlenir:</w:t>
+      </w:r>
+    </w:p>
+    <w:p>
+      <w:pPr>
+        <w:rPr>
+          <w:sz w:val="24"/>
+        </w:rPr>
+      </w:pPr>
+      <m:oMathPara>
+        <m:oMath>
+          <m:sSub>
+            <m:sSubPr>
+              <m:ctrlPr>
+                <w:rPr>
+                  <w:rFonts w:ascii="Cambria Math" w:hAnsi="Cambria Math"/>
+                  <w:i/>
+                  <w:sz w:val="24"/>
+                </w:rPr>
+              </m:ctrlPr>
+            </m:sSubPr>
+            <m:e>
+              <m:r>
+                <w:rPr>
+                  <w:rFonts w:ascii="Cambria Math" w:hAnsi="Cambria Math"/>
+                  <w:sz w:val="24"/>
+                </w:rPr>
+                <m:t>K</m:t>
+              </m:r>
+            </m:e>
+            <m:sub>
+              <m:r>
+                <w:rPr>
+                  <w:rFonts w:ascii="Cambria Math" w:hAnsi="Cambria Math"/>
+                  <w:sz w:val="24"/>
+                </w:rPr>
+                <m:t>d</m:t>
+              </m:r>
+            </m:sub>
+          </m:sSub>
+          <m:r>
+            <w:rPr>
+              <w:rFonts w:ascii="Cambria Math" w:hAnsi="Cambria Math"/>
+              <w:sz w:val="24"/>
+            </w:rPr>
+            <m:t xml:space="preserve"> =</m:t>
+          </m:r>
+          <m:f>
+            <m:fPr>
+              <m:ctrlPr>
+                <w:rPr>
+                  <w:rFonts w:ascii="Cambria Math" w:hAnsi="Cambria Math"/>
+                  <w:i/>
+                  <w:sz w:val="24"/>
+                </w:rPr>
+              </m:ctrlPr>
+            </m:fPr>
+            <m:num>
+              <m:r>
+                <w:rPr>
+                  <w:rFonts w:ascii="Cambria Math" w:hAnsi="Cambria Math"/>
+                  <w:sz w:val="24"/>
+                </w:rPr>
+                <m:t>dV</m:t>
+              </m:r>
+            </m:num>
+            <m:den>
+              <m:r>
+                <w:rPr>
+                  <w:rFonts w:ascii="Cambria Math" w:hAnsi="Cambria Math"/>
+                  <w:sz w:val="24"/>
+                </w:rPr>
+                <m:t>d(Δφ)</m:t>
+              </m:r>
+            </m:den>
+          </m:f>
+          <m:r>
+            <w:rPr>
+              <w:rFonts w:ascii="Cambria Math" w:hAnsi="Cambria Math"/>
+              <w:sz w:val="24"/>
+            </w:rPr>
+            <m:t>=</m:t>
+          </m:r>
+          <m:f>
+            <m:fPr>
+              <m:ctrlPr>
+                <w:rPr>
+                  <w:rFonts w:ascii="Cambria Math" w:hAnsi="Cambria Math"/>
+                  <w:i/>
+                  <w:sz w:val="24"/>
+                </w:rPr>
+              </m:ctrlPr>
+            </m:fPr>
+            <m:num>
+              <m:sSup>
+                <m:sSupPr>
+                  <m:ctrlPr>
+                    <w:rPr>
+                      <w:rFonts w:ascii="Cambria Math" w:hAnsi="Cambria Math"/>
+                      <w:i/>
+                      <w:sz w:val="24"/>
+                    </w:rPr>
+                  </m:ctrlPr>
+                </m:sSupPr>
+                <m:e>
+                  <m:r>
+                    <w:rPr>
+                      <w:rFonts w:ascii="Cambria Math" w:hAnsi="Cambria Math"/>
+                      <w:sz w:val="24"/>
+                    </w:rPr>
+                    <m:t>A</m:t>
+                  </m:r>
+                </m:e>
+                <m:sup>
+                  <m:r>
+                    <w:rPr>
+                      <w:rFonts w:ascii="Cambria Math" w:hAnsi="Cambria Math"/>
+                      <w:sz w:val="24"/>
+                    </w:rPr>
+                    <m:t>2</m:t>
+                  </m:r>
+                </m:sup>
+              </m:sSup>
+            </m:num>
+            <m:den>
+              <m:r>
+                <w:rPr>
+                  <w:rFonts w:ascii="Cambria Math" w:hAnsi="Cambria Math"/>
+                  <w:sz w:val="24"/>
+                </w:rPr>
+                <m:t>2</m:t>
+              </m:r>
+            </m:den>
+          </m:f>
+          <m:r>
+            <w:rPr>
+              <w:rFonts w:ascii="Cambria Math" w:hAnsi="Cambria Math"/>
+              <w:sz w:val="24"/>
+            </w:rPr>
+            <m:t>sin θ</m:t>
+          </m:r>
+        </m:oMath>
+      </m:oMathPara>
+    </w:p>
+    <w:p>
+      <w:r>
+        <w:t>Bu hassasiyet θ = 90°'de maksimumdur ve bu nokta quadrature çalışma noktası olarak adlandırılır. Bu noktanın seçilmesinin dört temel nedeni vardır:</w:t>
+      </w:r>
+    </w:p>
+    <w:p>
+      <w:pPr>
+        <w:pStyle w:val="ListParagraph"/>
+        <w:numPr>
+          <w:ilvl w:val="0"/>
+          <w:numId w:val="6"/>
+        </w:numPr>
+        <w:spacing w:line="360" w:lineRule="auto"/>
+        <w:rPr>
+          <w:b/>
+        </w:rPr>
+      </w:pPr>
+      <w:r>
+        <w:rPr>
+          <w:b/>
+        </w:rPr>
+        <w:t xml:space="preserve">Maksimum duyarlılık ve </w:t>
+      </w:r>
+      <w:r>
+        <w:rPr>
+          <w:b/>
+        </w:rPr>
+        <w:t>SNR</w:t>
+      </w:r>
+      <w:r>
+        <w:rPr>
+          <w:b/>
+        </w:rPr>
+        <w:t>:</w:t>
+      </w:r>
+      <w:r>
+        <w:rPr>
+          <w:b/>
+        </w:rPr>
+        <w:t xml:space="preserve"> </w:t>
+      </w:r>
+      <w:r>
+        <w:t xml:space="preserve">Gerilim tarafındaki toplamsal gürültü faza çevrilirken 1/sin θ ile büyür; SNR </w:t>
+      </w:r>
+      <w:r>
+        <w:rPr>
+          <w:rFonts w:ascii="Cambria Math" w:hAnsi="Cambria Math" w:cs="Cambria Math"/>
+        </w:rPr>
+        <w:t>∝</w:t>
+      </w:r>
+      <w:r>
+        <w:t xml:space="preserve"> sin </w:t>
+      </w:r>
+      <w:r>
+        <w:rPr>
+          <w:rFonts w:cs="Arial"/>
+        </w:rPr>
+        <w:t>θ</w:t>
+      </w:r>
+      <w:r>
+        <w:t xml:space="preserve"> oldu</w:t>
+      </w:r>
+      <w:r>
+        <w:rPr>
+          <w:rFonts w:cs="Arial"/>
+        </w:rPr>
+        <w:t>ğ</w:t>
+      </w:r>
+      <w:r>
+        <w:t>undan 90</w:t>
+      </w:r>
+      <w:r>
+        <w:rPr>
+          <w:rFonts w:cs="Arial"/>
+        </w:rPr>
+        <w:t>°</w:t>
+      </w:r>
+      <w:r>
+        <w:t>'de en iyi, 0</w:t>
+      </w:r>
+      <w:r>
+        <w:rPr>
+          <w:rFonts w:cs="Arial"/>
+        </w:rPr>
+        <w:t>°</w:t>
+      </w:r>
+      <w:r>
+        <w:t>'a yak</w:t>
+      </w:r>
+      <w:r>
+        <w:rPr>
+          <w:rFonts w:cs="Arial"/>
+        </w:rPr>
+        <w:t>ı</w:t>
+      </w:r>
+      <w:r>
+        <w:t>n anlams</w:t>
+      </w:r>
+      <w:r>
+        <w:rPr>
+          <w:rFonts w:cs="Arial"/>
+        </w:rPr>
+        <w:t>ı</w:t>
+      </w:r>
+      <w:r>
+        <w:t>zd</w:t>
+      </w:r>
+      <w:r>
+        <w:rPr>
+          <w:rFonts w:cs="Arial"/>
+        </w:rPr>
+        <w:t>ı</w:t>
+      </w:r>
+      <w:r>
+        <w:t>r</w:t>
+      </w:r>
+      <w:r>
+        <w:rPr>
+          <w:b/>
+        </w:rPr>
+        <w:t>.</w:t>
+      </w:r>
+    </w:p>
+    <w:p>
+      <w:pPr>
+        <w:pStyle w:val="ListParagraph"/>
+        <w:numPr>
+          <w:ilvl w:val="0"/>
+          <w:numId w:val="6"/>
+        </w:numPr>
+        <w:spacing w:line="360" w:lineRule="auto"/>
+      </w:pPr>
+      <w:proofErr w:type="spellStart"/>
+      <w:r>
+        <w:rPr>
+          <w:b/>
+        </w:rPr>
+        <w:t>Doğrusallık</w:t>
+      </w:r>
+      <w:proofErr w:type="spellEnd"/>
+      <w:r>
+        <w:rPr>
+          <w:b/>
+        </w:rPr>
+        <w:t xml:space="preserve">: </w:t>
+      </w:r>
+      <w:r>
+        <w:t xml:space="preserve">90° civarında tepki V </w:t>
+      </w:r>
+      <w:r>
+        <w:rPr>
+          <w:rFonts w:ascii="Cambria Math" w:hAnsi="Cambria Math" w:cs="Cambria Math"/>
+        </w:rPr>
+        <w:t>∝</w:t>
+      </w:r>
+      <w:r>
+        <w:t xml:space="preserve"> sin(</w:t>
+      </w:r>
+      <w:r>
+        <w:rPr>
+          <w:rFonts w:cs="Arial"/>
+        </w:rPr>
+        <w:t>Δφ</w:t>
+      </w:r>
+      <w:r>
+        <w:t xml:space="preserve">) </w:t>
+      </w:r>
+      <w:r>
+        <w:rPr>
+          <w:rFonts w:cs="Arial"/>
+        </w:rPr>
+        <w:t>≈</w:t>
+      </w:r>
+      <w:r>
+        <w:t xml:space="preserve"> </w:t>
+      </w:r>
+      <w:r>
+        <w:rPr>
+          <w:rFonts w:cs="Arial"/>
+        </w:rPr>
+        <w:t>Δφ</w:t>
+      </w:r>
+      <w:r>
+        <w:t xml:space="preserve"> ile do</w:t>
+      </w:r>
+      <w:r>
+        <w:rPr>
+          <w:rFonts w:cs="Arial"/>
+        </w:rPr>
+        <w:t>ğ</w:t>
+      </w:r>
+      <w:r>
+        <w:t>rusald</w:t>
+      </w:r>
+      <w:r>
+        <w:rPr>
+          <w:rFonts w:cs="Arial"/>
+        </w:rPr>
+        <w:t>ı</w:t>
+      </w:r>
+      <w:r>
+        <w:t>r; 0</w:t>
+      </w:r>
+      <w:r>
+        <w:rPr>
+          <w:rFonts w:cs="Arial"/>
+        </w:rPr>
+        <w:t>°</w:t>
+      </w:r>
+      <w:r>
+        <w:t>/180</w:t>
+      </w:r>
+      <w:r>
+        <w:rPr>
+          <w:rFonts w:cs="Arial"/>
+        </w:rPr>
+        <w:t>°</w:t>
+      </w:r>
+      <w:r>
+        <w:t>'de e</w:t>
+      </w:r>
+      <w:r>
+        <w:rPr>
+          <w:rFonts w:cs="Arial"/>
+        </w:rPr>
+        <w:t>ğ</w:t>
+      </w:r>
+      <w:r>
+        <w:t>im s</w:t>
+      </w:r>
+      <w:r>
+        <w:rPr>
+          <w:rFonts w:cs="Arial"/>
+        </w:rPr>
+        <w:t>ı</w:t>
+      </w:r>
+      <w:r>
+        <w:t>f</w:t>
+      </w:r>
+      <w:r>
+        <w:rPr>
+          <w:rFonts w:cs="Arial"/>
+        </w:rPr>
+        <w:t>ı</w:t>
+      </w:r>
+      <w:r>
+        <w:t>r oldu</w:t>
+      </w:r>
+      <w:r>
+        <w:rPr>
+          <w:rFonts w:cs="Arial"/>
+        </w:rPr>
+        <w:t>ğ</w:t>
+      </w:r>
+      <w:r>
+        <w:t xml:space="preserve">undan tepki </w:t>
+      </w:r>
+      <w:r>
+        <w:rPr>
+          <w:rFonts w:ascii="Cambria Math" w:hAnsi="Cambria Math" w:cs="Cambria Math"/>
+        </w:rPr>
+        <w:t>∝</w:t>
+      </w:r>
+      <w:r>
+        <w:t xml:space="preserve"> </w:t>
+      </w:r>
+      <w:r>
+        <w:rPr>
+          <w:rFonts w:cs="Arial"/>
+        </w:rPr>
+        <w:t>Δφ²</w:t>
+      </w:r>
+      <w:r>
+        <w:t>'ye d</w:t>
+      </w:r>
+      <w:r>
+        <w:rPr>
+          <w:rFonts w:cs="Arial"/>
+        </w:rPr>
+        <w:t>üş</w:t>
+      </w:r>
+      <w:r>
+        <w:t>er, faz</w:t>
+      </w:r>
+      <w:r>
+        <w:rPr>
+          <w:rFonts w:cs="Arial"/>
+        </w:rPr>
+        <w:t>ı</w:t>
+      </w:r>
+      <w:r>
+        <w:t>n i</w:t>
+      </w:r>
+      <w:r>
+        <w:rPr>
+          <w:rFonts w:cs="Arial"/>
+        </w:rPr>
+        <w:t>ş</w:t>
+      </w:r>
+      <w:r>
+        <w:t>areti kaybolur ve harmonik bozulma olu</w:t>
+      </w:r>
+      <w:r>
+        <w:rPr>
+          <w:rFonts w:cs="Arial"/>
+        </w:rPr>
+        <w:t>ş</w:t>
+      </w:r>
+      <w:r>
+        <w:t>ur</w:t>
+      </w:r>
+      <w:r>
+        <w:t>.</w:t>
+      </w:r>
+    </w:p>
+    <w:p>
+      <w:pPr>
+        <w:pStyle w:val="ListParagraph"/>
+        <w:numPr>
+          <w:ilvl w:val="0"/>
+          <w:numId w:val="6"/>
+        </w:numPr>
+        <w:spacing w:line="360" w:lineRule="auto"/>
+      </w:pPr>
+      <w:r>
+        <w:rPr>
+          <w:b/>
+        </w:rPr>
+        <w:t>Sıfır DC bileşen</w:t>
+      </w:r>
+      <w:r>
+        <w:t xml:space="preserve">: cos 90° = 0 olduğundan taban bant yükselteci </w:t>
+      </w:r>
+      <w:r>
+        <w:t>DC blokajlı</w:t>
+      </w:r>
+      <w:r>
+        <w:t xml:space="preserve"> ve yüksek kazançlı çalışabilir; diğer açılarda büyük DC terim ve sürüklenme küçük faz dalgalanmalarını maskeler.</w:t>
+      </w:r>
+    </w:p>
+    <w:p>
+      <w:pPr>
+        <w:pStyle w:val="ListParagraph"/>
+        <w:numPr>
+          <w:ilvl w:val="0"/>
+          <w:numId w:val="6"/>
+        </w:numPr>
+        <w:spacing w:line="360" w:lineRule="auto"/>
+        <w:rPr>
+          <w:b/>
+        </w:rPr>
+      </w:pPr>
+      <w:r>
+        <w:rPr>
+          <w:b/>
+        </w:rPr>
+        <w:t xml:space="preserve">AM bastırma: </w:t>
+      </w:r>
+      <w:r>
+        <w:t>Genlik dalgalanmaları çıkışa cosθ</w:t>
+      </w:r>
+      <w:bookmarkStart w:id="1" w:name="_GoBack"/>
+      <w:bookmarkEnd w:id="1"/>
+      <w:r>
+        <w:t xml:space="preserve"> ile sızar; 90°'de birinci mertebeden yok olur. Diğer açılarda sızan AM iki kanalda </w:t>
+      </w:r>
+      <w:proofErr w:type="spellStart"/>
+      <w:r>
+        <w:t>korele</w:t>
+      </w:r>
+      <w:proofErr w:type="spellEnd"/>
+      <w:r>
+        <w:t xml:space="preserve"> olduğundan </w:t>
+      </w:r>
+      <w:proofErr w:type="spellStart"/>
+      <w:r>
+        <w:t>cross-correlation</w:t>
+      </w:r>
+      <w:proofErr w:type="spellEnd"/>
+      <w:r>
+        <w:t xml:space="preserve"> ile de temizlenemez.</w:t>
+      </w:r>
+    </w:p>
+    <w:p>
+      <w:pPr>
+        <w:spacing w:line="276" w:lineRule="auto"/>
+        <w:ind w:left="360"/>
+        <w:rPr>
+          <w:b/>
+        </w:rPr>
+      </w:pPr>
+      <w:r>
+        <w:rPr>
+          <w:b/>
+        </w:rPr>
+        <w:t xml:space="preserve">Simülasyonla ilişkisi: </w:t>
+      </w:r>
+      <w:r>
+        <w:t>Simülasyonda mikser karakteristiği asin() ile birebir ters çevrildiğinden faz farkı her açıda birim kazançla geri çatılır ve sweep sonuçları benzer çıkar; ancak bu ters çevirme gerilim tarafında toplamsal gürültü olmadığı varsayımına dayanır, gerçek donanımda gürültü 1/sinθ ile büyür. Dolayısıyla 90° algoritmanın değil, analog ön ucun optimumudur.</w:t>
+      </w:r>
+    </w:p>
+    <w:p>
+      <w:pPr>
+        <w:spacing w:line="360" w:lineRule="auto"/>
+        <w:ind w:left="360"/>
+        <w:jc w:val="center"/>
+        <w:rPr>
+          <w:b/>
+        </w:rPr>
+      </w:pPr>
+      <w:r>
+        <w:rPr>
+          <w:noProof/>
+        </w:rPr>
+        <w:drawing>
+          <wp:inline distT="0" distB="0" distL="0" distR="0">
+            <wp:extent cx="5217795" cy="2708259"/>
+            <wp:effectExtent l="0" t="0" r="1905" b="0"/>
+            <wp:docPr id="11" name="Picture 11"/>
+            <wp:cNvGraphicFramePr>
+              <a:graphicFrameLocks xmlns:a="http://schemas.openxmlformats.org/drawingml/2006/main" noChangeAspect="1"/>
+            </wp:cNvGraphicFramePr>
+            <a:graphic xmlns:a="http://schemas.openxmlformats.org/drawingml/2006/main">
+              <a:graphicData uri="http://schemas.openxmlformats.org/drawingml/2006/picture">
+                <pic:pic xmlns:pic="http://schemas.openxmlformats.org/drawingml/2006/picture">
+                  <pic:nvPicPr>
+                    <pic:cNvPr id="0" name="Picture 1"/>
+                    <pic:cNvPicPr>
+                      <a:picLocks noChangeAspect="1" noChangeArrowheads="1"/>
+                    </pic:cNvPicPr>
+                  </pic:nvPicPr>
+                  <pic:blipFill rotWithShape="1">
+                    <a:blip r:embed="rId20" cstate="print">
+                      <a:extLst>
+                        <a:ext uri="{28A0092B-C50C-407E-A947-70E740481C1C}">
+                          <a14:useLocalDpi xmlns:a14="http://schemas.microsoft.com/office/drawing/2010/main" val="0"/>
+                        </a:ext>
+                      </a:extLst>
+                    </a:blip>
+                    <a:srcRect t="2355"/>
+                    <a:stretch/>
+                  </pic:blipFill>
+                  <pic:spPr bwMode="auto">
+                    <a:xfrm>
+                      <a:off x="0" y="0"/>
+                      <a:ext cx="5234823" cy="2717097"/>
+                    </a:xfrm>
+                    <a:prstGeom prst="rect">
+                      <a:avLst/>
+                    </a:prstGeom>
+                    <a:noFill/>
+                    <a:ln>
+                      <a:noFill/>
+                    </a:ln>
+                    <a:extLst>
+                      <a:ext uri="{53640926-AAD7-44D8-BBD7-CCE9431645EC}">
+                        <a14:shadowObscured xmlns:a14="http://schemas.microsoft.com/office/drawing/2010/main"/>
+                      </a:ext>
+                    </a:extLst>
+                  </pic:spPr>
+                </pic:pic>
+              </a:graphicData>
+            </a:graphic>
+          </wp:inline>
+        </w:drawing>
+      </w:r>
+    </w:p>
+    <w:p>
+      <w:pPr>
+        <w:jc w:val="center"/>
+        <w:rPr>
+          <w:i/>
+          <w:sz w:val="18"/>
+        </w:rPr>
+      </w:pPr>
+      <w:r>
+        <w:rPr>
+          <w:i/>
+          <w:sz w:val="18"/>
+        </w:rPr>
+        <w:t xml:space="preserve">Şekil </w:t>
+      </w:r>
+      <w:r>
+        <w:rPr>
+          <w:i/>
+          <w:sz w:val="18"/>
+        </w:rPr>
         <w:t>5</w:t>
       </w:r>
       <w:r>
-        <w:t xml:space="preserve">.4. Diğer </w:t>
-      </w:r>
-      <w:r>
-        <w:t>y</w:t>
-      </w:r>
-      <w:r>
-        <w:t>öntemler</w:t>
-      </w:r>
-    </w:p>
-    <w:p>
-      <w:r>
-        <w:rPr>
-          <w:b/>
-        </w:rPr>
-        <w:t>Gecikme hattı ayırıcısı</w:t>
-      </w:r>
-      <w:r>
-        <w:t xml:space="preserve"> yönteminde DUT sinyali iki kola ayrılarak kollardan biri geciktirilir ve frekans değişimleri faz değişimine dönüştürülür.</w:t>
-      </w:r>
-    </w:p>
-    <w:p>
-      <w:r>
-        <w:rPr>
-          <w:b/>
-        </w:rPr>
-        <w:t>Dijital faz demodülasyonunda</w:t>
-      </w:r>
-      <w:r>
-        <w:t xml:space="preserve"> ise işaret sayısallaştırılarak I/Q bileşenlerinden anlık faz hesaplanır.</w:t>
-      </w:r>
-    </w:p>
-    <w:p>
-      <w:r>
-        <w:t>Bu yöntemler farklı uygulamalarda avantajlı olsa da bu çalışmanın odağını faz detektörü tabanlı cross-correlation yöntemi oluşturmaktadır.</w:t>
-      </w:r>
-    </w:p>
-    <w:p/>
-    <w:p/>
+        <w:rPr>
+          <w:i/>
+          <w:sz w:val="18"/>
+        </w:rPr>
+        <w:t>.</w:t>
+      </w:r>
+      <w:r>
+        <w:rPr>
+          <w:i/>
+          <w:sz w:val="18"/>
+        </w:rPr>
+        <w:t>4</w:t>
+      </w:r>
+      <w:r>
+        <w:rPr>
+          <w:i/>
+          <w:sz w:val="18"/>
+        </w:rPr>
+        <w:t xml:space="preserve"> – </w:t>
+      </w:r>
+      <w:r>
+        <w:rPr>
+          <w:i/>
+          <w:sz w:val="18"/>
+        </w:rPr>
+        <w:t>Farklı faz farkı değerlerinde Cross-PSD’nin</w:t>
+      </w:r>
+      <w:r>
+        <w:rPr>
+          <w:i/>
+          <w:sz w:val="18"/>
+        </w:rPr>
+        <w:t>,</w:t>
+      </w:r>
+      <w:r>
+        <w:rPr>
+          <w:i/>
+          <w:sz w:val="18"/>
+        </w:rPr>
+        <w:t xml:space="preserve"> DUT’ye yakınlığı</w:t>
+      </w:r>
+    </w:p>
     <w:p/>
     <w:p>
       <w:pPr>
@@ -4730,7 +5951,7 @@
                     </pic:cNvPicPr>
                   </pic:nvPicPr>
                   <pic:blipFill>
-                    <a:blip r:embed="rId20">
+                    <a:blip r:embed="rId21">
                       <a:extLst>
                         <a:ext uri="{28A0092B-C50C-407E-A947-70E740481C1C}">
                           <a14:useLocalDpi xmlns:a14="http://schemas.microsoft.com/office/drawing/2010/main" val="0"/>
@@ -4883,15 +6104,7 @@
         <w:rPr>
           <w:rFonts w:eastAsiaTheme="minorEastAsia"/>
         </w:rPr>
-        <w:t>Sonrasında her sinyal için gürültü üretimi birbirinden bağımsız ve farklı çağrılarda yapılır, yapılan gürültü oluşturma çağrısında her seferinde zaman damgasının büyük bir asal sayıyla çarpımının 10000 ile modülasyonu seed</w:t>
-      </w:r>
-      <w:bookmarkStart w:id="1" w:name="_GoBack"/>
-      <w:bookmarkEnd w:id="1"/>
-      <w:r>
-        <w:rPr>
-          <w:rFonts w:eastAsiaTheme="minorEastAsia"/>
-        </w:rPr>
-        <w:t xml:space="preserve"> olarak kullanılır ve bu şekilde üretilen sinyallerin birbirinden tamamen bağımsız olması sağlanır.</w:t>
+        <w:t>Sonrasında her sinyal için gürültü üretimi birbirinden bağımsız ve farklı çağrılarda yapılır, yapılan gürültü oluşturma çağrısında her seferinde zaman damgasının büyük bir asal sayıyla çarpımının 10000 ile modülasyonu seed olarak kullanılır ve bu şekilde üretilen sinyallerin birbirinden tamamen bağımsız olması sağlanır.</w:t>
       </w:r>
     </w:p>
     <w:p>
@@ -6402,15 +7615,7 @@
     </w:p>
     <w:p>
       <w:r>
-        <w:t xml:space="preserve">Bin merkezleri geometrik frekans ortalamasıyla, bin gücü ise doğrusal </w:t>
-      </w:r>
-      <w:proofErr w:type="spellStart"/>
-      <w:r>
-        <w:t>PSD’nin</w:t>
-      </w:r>
-      <w:proofErr w:type="spellEnd"/>
-      <w:r>
-        <w:t xml:space="preserve"> aritmetik ortalamasıyla elde edilir. SSB dBc/Hz dönüşümü binlemeden sonra uygulanır. MAE, iki </w:t>
+        <w:t xml:space="preserve">Bin merkezleri geometrik frekans ortalamasıyla, bin gücü ise doğrusal PSD’nin aritmetik ortalamasıyla elde edilir. SSB dBc/Hz dönüşümü binlemeden sonra uygulanır. MAE, iki </w:t>
       </w:r>
       <w:proofErr w:type="spellStart"/>
       <w:r>
@@ -6853,7 +8058,7 @@
                     </pic:cNvPicPr>
                   </pic:nvPicPr>
                   <pic:blipFill>
-                    <a:blip r:embed="rId21">
+                    <a:blip r:embed="rId22">
                       <a:extLst>
                         <a:ext uri="{28A0092B-C50C-407E-A947-70E740481C1C}">
                           <a14:useLocalDpi xmlns:a14="http://schemas.microsoft.com/office/drawing/2010/main" val="0"/>
@@ -7322,7 +8527,7 @@
                     </pic:cNvPicPr>
                   </pic:nvPicPr>
                   <pic:blipFill rotWithShape="1">
-                    <a:blip r:embed="rId22" cstate="print">
+                    <a:blip r:embed="rId23" cstate="print">
                       <a:extLst>
                         <a:ext uri="{28A0092B-C50C-407E-A947-70E740481C1C}">
                           <a14:useLocalDpi xmlns:a14="http://schemas.microsoft.com/office/drawing/2010/main" val="0"/>
@@ -9265,7 +10470,7 @@
                     </pic:cNvPicPr>
                   </pic:nvPicPr>
                   <pic:blipFill rotWithShape="1">
-                    <a:blip r:embed="rId23" cstate="print">
+                    <a:blip r:embed="rId24" cstate="print">
                       <a:extLst>
                         <a:ext uri="{28A0092B-C50C-407E-A947-70E740481C1C}">
                           <a14:useLocalDpi xmlns:a14="http://schemas.microsoft.com/office/drawing/2010/main" val="0"/>
@@ -9609,7 +10814,7 @@
                     </pic:cNvPicPr>
                   </pic:nvPicPr>
                   <pic:blipFill rotWithShape="1">
-                    <a:blip r:embed="rId24" cstate="print">
+                    <a:blip r:embed="rId25" cstate="print">
                       <a:extLst>
                         <a:ext uri="{28A0092B-C50C-407E-A947-70E740481C1C}">
                           <a14:useLocalDpi xmlns:a14="http://schemas.microsoft.com/office/drawing/2010/main" val="0"/>
@@ -9896,7 +11101,7 @@
                     </pic:cNvPicPr>
                   </pic:nvPicPr>
                   <pic:blipFill rotWithShape="1">
-                    <a:blip r:embed="rId25" cstate="print">
+                    <a:blip r:embed="rId26" cstate="print">
                       <a:extLst>
                         <a:ext uri="{28A0092B-C50C-407E-A947-70E740481C1C}">
                           <a14:useLocalDpi xmlns:a14="http://schemas.microsoft.com/office/drawing/2010/main" val="0"/>
@@ -10160,15 +11365,7 @@
       </w:r>
       <w:proofErr w:type="spellEnd"/>
       <w:r>
-        <w:t xml:space="preserve"> üretildiğinden fark yalnız binleme çözünürlüğüne bağlanamaz. Aynı tam çözünürlüklü </w:t>
-      </w:r>
-      <w:proofErr w:type="spellStart"/>
-      <w:r>
-        <w:t>PSD'nin</w:t>
-      </w:r>
-      <w:proofErr w:type="spellEnd"/>
-      <w:r>
-        <w:t xml:space="preserve"> yeniden </w:t>
+        <w:t xml:space="preserve"> üretildiğinden fark yalnız binleme çözünürlüğüne bağlanamaz. Aynı tam çözünürlüklü PSD'nin yeniden </w:t>
       </w:r>
       <w:proofErr w:type="spellStart"/>
       <w:r>
@@ -10209,7 +11406,7 @@
                     </pic:cNvPicPr>
                   </pic:nvPicPr>
                   <pic:blipFill rotWithShape="1">
-                    <a:blip r:embed="rId26" cstate="print">
+                    <a:blip r:embed="rId27" cstate="print">
                       <a:extLst>
                         <a:ext uri="{28A0092B-C50C-407E-A947-70E740481C1C}">
                           <a14:useLocalDpi xmlns:a14="http://schemas.microsoft.com/office/drawing/2010/main" val="0"/>
@@ -10673,7 +11870,7 @@
                     <pic:cNvPicPr/>
                   </pic:nvPicPr>
                   <pic:blipFill>
-                    <a:blip r:embed="rId27"/>
+                    <a:blip r:embed="rId28"/>
                     <a:stretch>
                       <a:fillRect/>
                     </a:stretch>
@@ -12688,7 +13885,7 @@
                     </pic:cNvPicPr>
                   </pic:nvPicPr>
                   <pic:blipFill rotWithShape="1">
-                    <a:blip r:embed="rId28" cstate="print">
+                    <a:blip r:embed="rId29" cstate="print">
                       <a:extLst>
                         <a:ext uri="{28A0092B-C50C-407E-A947-70E740481C1C}">
                           <a14:useLocalDpi xmlns:a14="http://schemas.microsoft.com/office/drawing/2010/main" val="0"/>
@@ -12780,8 +13977,8 @@
       </w:r>
     </w:p>
     <w:sectPr>
-      <w:headerReference w:type="default" r:id="rId29"/>
-      <w:footerReference w:type="default" r:id="rId30"/>
+      <w:headerReference w:type="default" r:id="rId30"/>
+      <w:footerReference w:type="default" r:id="rId31"/>
       <w:pgSz w:w="11906" w:h="16838"/>
       <w:pgMar w:top="1417" w:right="1417" w:bottom="1417" w:left="1417" w:header="708" w:footer="708" w:gutter="0"/>
       <w:cols w:space="708"/>
@@ -13225,6 +14422,95 @@
     </w:lvl>
   </w:abstractNum>
   <w:abstractNum w:abstractNumId="3" w15:restartNumberingAfterBreak="0">
+    <w:nsid w:val="38D86F76"/>
+    <w:multiLevelType w:val="hybridMultilevel"/>
+    <w:tmpl w:val="EFECD05C"/>
+    <w:lvl w:ilvl="0" w:tplc="13B2F968">
+      <w:start w:val="1"/>
+      <w:numFmt w:val="decimal"/>
+      <w:lvlText w:val="%1."/>
+      <w:lvlJc w:val="left"/>
+      <w:pPr>
+        <w:ind w:left="720" w:hanging="360"/>
+      </w:pPr>
+      <w:rPr>
+        <w:b/>
+      </w:rPr>
+    </w:lvl>
+    <w:lvl w:ilvl="1" w:tplc="041F0019" w:tentative="1">
+      <w:start w:val="1"/>
+      <w:numFmt w:val="lowerLetter"/>
+      <w:lvlText w:val="%2."/>
+      <w:lvlJc w:val="left"/>
+      <w:pPr>
+        <w:ind w:left="1440" w:hanging="360"/>
+      </w:pPr>
+    </w:lvl>
+    <w:lvl w:ilvl="2" w:tplc="041F001B" w:tentative="1">
+      <w:start w:val="1"/>
+      <w:numFmt w:val="lowerRoman"/>
+      <w:lvlText w:val="%3."/>
+      <w:lvlJc w:val="right"/>
+      <w:pPr>
+        <w:ind w:left="2160" w:hanging="180"/>
+      </w:pPr>
+    </w:lvl>
+    <w:lvl w:ilvl="3" w:tplc="041F000F" w:tentative="1">
+      <w:start w:val="1"/>
+      <w:numFmt w:val="decimal"/>
+      <w:lvlText w:val="%4."/>
+      <w:lvlJc w:val="left"/>
+      <w:pPr>
+        <w:ind w:left="2880" w:hanging="360"/>
+      </w:pPr>
+    </w:lvl>
+    <w:lvl w:ilvl="4" w:tplc="041F0019" w:tentative="1">
+      <w:start w:val="1"/>
+      <w:numFmt w:val="lowerLetter"/>
+      <w:lvlText w:val="%5."/>
+      <w:lvlJc w:val="left"/>
+      <w:pPr>
+        <w:ind w:left="3600" w:hanging="360"/>
+      </w:pPr>
+    </w:lvl>
+    <w:lvl w:ilvl="5" w:tplc="041F001B" w:tentative="1">
+      <w:start w:val="1"/>
+      <w:numFmt w:val="lowerRoman"/>
+      <w:lvlText w:val="%6."/>
+      <w:lvlJc w:val="right"/>
+      <w:pPr>
+        <w:ind w:left="4320" w:hanging="180"/>
+      </w:pPr>
+    </w:lvl>
+    <w:lvl w:ilvl="6" w:tplc="041F000F" w:tentative="1">
+      <w:start w:val="1"/>
+      <w:numFmt w:val="decimal"/>
+      <w:lvlText w:val="%7."/>
+      <w:lvlJc w:val="left"/>
+      <w:pPr>
+        <w:ind w:left="5040" w:hanging="360"/>
+      </w:pPr>
+    </w:lvl>
+    <w:lvl w:ilvl="7" w:tplc="041F0019" w:tentative="1">
+      <w:start w:val="1"/>
+      <w:numFmt w:val="lowerLetter"/>
+      <w:lvlText w:val="%8."/>
+      <w:lvlJc w:val="left"/>
+      <w:pPr>
+        <w:ind w:left="5760" w:hanging="360"/>
+      </w:pPr>
+    </w:lvl>
+    <w:lvl w:ilvl="8" w:tplc="041F001B" w:tentative="1">
+      <w:start w:val="1"/>
+      <w:numFmt w:val="lowerRoman"/>
+      <w:lvlText w:val="%9."/>
+      <w:lvlJc w:val="right"/>
+      <w:pPr>
+        <w:ind w:left="6480" w:hanging="180"/>
+      </w:pPr>
+    </w:lvl>
+  </w:abstractNum>
+  <w:abstractNum w:abstractNumId="4" w15:restartNumberingAfterBreak="0">
     <w:nsid w:val="65FB0967"/>
     <w:multiLevelType w:val="hybridMultilevel"/>
     <w:tmpl w:val="E7BA75F6"/>
@@ -13337,7 +14623,7 @@
       </w:rPr>
     </w:lvl>
   </w:abstractNum>
-  <w:abstractNum w:abstractNumId="4" w15:restartNumberingAfterBreak="0">
+  <w:abstractNum w:abstractNumId="5" w15:restartNumberingAfterBreak="0">
     <w:nsid w:val="66E7693F"/>
     <w:multiLevelType w:val="multilevel"/>
     <w:tmpl w:val="307ED1DE"/>
@@ -13459,7 +14745,7 @@
     </w:lvl>
   </w:abstractNum>
   <w:num w:numId="1">
-    <w:abstractNumId w:val="4"/>
+    <w:abstractNumId w:val="5"/>
   </w:num>
   <w:num w:numId="2">
     <w:abstractNumId w:val="2"/>
@@ -13471,6 +14757,9 @@
     <w:abstractNumId w:val="1"/>
   </w:num>
   <w:num w:numId="5">
+    <w:abstractNumId w:val="4"/>
+  </w:num>
+  <w:num w:numId="6">
     <w:abstractNumId w:val="3"/>
   </w:num>
 </w:numbering>
@@ -14719,7 +16008,7 @@
 </file>
 
 <file path=customXml/itemProps1.xml><?xml version="1.0" encoding="utf-8"?>
-<ds:datastoreItem xmlns:ds="http://schemas.openxmlformats.org/officeDocument/2006/customXml" ds:itemID="{B370CFBA-D027-402D-AF10-B86AFB63C622}">
+<ds:datastoreItem xmlns:ds="http://schemas.openxmlformats.org/officeDocument/2006/customXml" ds:itemID="{3BD13FA0-3A00-428C-9A19-2ADADBE4AC7B}">
   <ds:schemaRefs>
     <ds:schemaRef ds:uri="http://schemas.openxmlformats.org/officeDocument/2006/bibliography"/>
   </ds:schemaRefs>

</xml_diff>